<commit_message>
Model and DB managemenent with Python shell
</commit_message>
<xml_diff>
--- a/00.-Introducción a Django.docx
+++ b/00.-Introducción a Django.docx
@@ -734,7 +734,7 @@
           <w:r>
             <w:fldChar w:fldCharType="separate"/>
           </w:r>
-          <w:hyperlink w:anchor="_Toc229916823" w:history="1">
+          <w:hyperlink w:anchor="_Toc229992082" w:history="1">
             <w:r>
               <w:rPr>
                 <w:rStyle w:val="Hipervnculo"/>
@@ -762,7 +762,7 @@
                 <w:noProof/>
                 <w:webHidden/>
               </w:rPr>
-              <w:instrText xml:space="preserve"> PAGEREF _Toc229916823 \h </w:instrText>
+              <w:instrText xml:space="preserve"> PAGEREF _Toc229992082 \h </w:instrText>
             </w:r>
             <w:r>
               <w:rPr>
@@ -808,7 +808,7 @@
               <w14:ligatures w14:val="standardContextual"/>
             </w:rPr>
           </w:pPr>
-          <w:hyperlink w:anchor="_Toc229916824" w:history="1">
+          <w:hyperlink w:anchor="_Toc229992083" w:history="1">
             <w:r>
               <w:rPr>
                 <w:rStyle w:val="Hipervnculo"/>
@@ -835,7 +835,7 @@
                 <w:noProof/>
                 <w:webHidden/>
               </w:rPr>
-              <w:instrText xml:space="preserve"> PAGEREF _Toc229916824 \h </w:instrText>
+              <w:instrText xml:space="preserve"> PAGEREF _Toc229992083 \h </w:instrText>
             </w:r>
             <w:r>
               <w:rPr>
@@ -881,7 +881,7 @@
               <w14:ligatures w14:val="standardContextual"/>
             </w:rPr>
           </w:pPr>
-          <w:hyperlink w:anchor="_Toc229916825" w:history="1">
+          <w:hyperlink w:anchor="_Toc229992084" w:history="1">
             <w:r>
               <w:rPr>
                 <w:rStyle w:val="Hipervnculo"/>
@@ -909,7 +909,7 @@
                 <w:noProof/>
                 <w:webHidden/>
               </w:rPr>
-              <w:instrText xml:space="preserve"> PAGEREF _Toc229916825 \h </w:instrText>
+              <w:instrText xml:space="preserve"> PAGEREF _Toc229992084 \h </w:instrText>
             </w:r>
             <w:r>
               <w:rPr>
@@ -955,7 +955,7 @@
               <w14:ligatures w14:val="standardContextual"/>
             </w:rPr>
           </w:pPr>
-          <w:hyperlink w:anchor="_Toc229916826" w:history="1">
+          <w:hyperlink w:anchor="_Toc229992085" w:history="1">
             <w:r>
               <w:rPr>
                 <w:rStyle w:val="Hipervnculo"/>
@@ -982,7 +982,7 @@
                 <w:noProof/>
                 <w:webHidden/>
               </w:rPr>
-              <w:instrText xml:space="preserve"> PAGEREF _Toc229916826 \h </w:instrText>
+              <w:instrText xml:space="preserve"> PAGEREF _Toc229992085 \h </w:instrText>
             </w:r>
             <w:r>
               <w:rPr>
@@ -1028,27 +1028,13 @@
               <w14:ligatures w14:val="standardContextual"/>
             </w:rPr>
           </w:pPr>
-          <w:hyperlink w:anchor="_Toc229916827" w:history="1">
+          <w:hyperlink w:anchor="_Toc229992086" w:history="1">
             <w:r>
               <w:rPr>
                 <w:rStyle w:val="Hipervnculo"/>
                 <w:noProof/>
               </w:rPr>
-              <w:t>Tipos de Relaciones en</w:t>
-            </w:r>
-            <w:r>
-              <w:rPr>
-                <w:rStyle w:val="Hipervnculo"/>
-                <w:noProof/>
-              </w:rPr>
-              <w:t>t</w:t>
-            </w:r>
-            <w:r>
-              <w:rPr>
-                <w:rStyle w:val="Hipervnculo"/>
-                <w:noProof/>
-              </w:rPr>
-              <w:t>re Tablas: Uno a Muchos, Muchos a Muchos y Uno a Uno</w:t>
+              <w:t>Tipos de Relaciones entre Tablas: Uno a Muchos, Muchos a Muchos y Uno a Uno</w:t>
             </w:r>
             <w:r>
               <w:rPr>
@@ -1069,7 +1055,7 @@
                 <w:noProof/>
                 <w:webHidden/>
               </w:rPr>
-              <w:instrText xml:space="preserve"> PAGEREF _Toc229916827 \h </w:instrText>
+              <w:instrText xml:space="preserve"> PAGEREF _Toc229992086 \h </w:instrText>
             </w:r>
             <w:r>
               <w:rPr>
@@ -1102,7 +1088,7 @@
         </w:p>
         <w:p>
           <w:pPr>
-            <w:pStyle w:val="TDC1"/>
+            <w:pStyle w:val="TDC3"/>
             <w:tabs>
               <w:tab w:val="right" w:leader="dot" w:pos="9350"/>
             </w:tabs>
@@ -1115,13 +1101,13 @@
               <w14:ligatures w14:val="standardContextual"/>
             </w:rPr>
           </w:pPr>
-          <w:hyperlink w:anchor="_Toc229916828" w:history="1">
+          <w:hyperlink w:anchor="_Toc229992087" w:history="1">
             <w:r>
               <w:rPr>
                 <w:rStyle w:val="Hipervnculo"/>
                 <w:noProof/>
               </w:rPr>
-              <w:t>Referencias</w:t>
+              <w:t>URLs.py: Archivo de Configuración de Endpoints</w:t>
             </w:r>
             <w:r>
               <w:rPr>
@@ -1142,7 +1128,7 @@
                 <w:noProof/>
                 <w:webHidden/>
               </w:rPr>
-              <w:instrText xml:space="preserve"> PAGEREF _Toc229916828 \h </w:instrText>
+              <w:instrText xml:space="preserve"> PAGEREF _Toc229992087 \h </w:instrText>
             </w:r>
             <w:r>
               <w:rPr>
@@ -1174,6 +1160,79 @@
           </w:hyperlink>
         </w:p>
         <w:p>
+          <w:pPr>
+            <w:pStyle w:val="TDC1"/>
+            <w:tabs>
+              <w:tab w:val="right" w:leader="dot" w:pos="9350"/>
+            </w:tabs>
+            <w:rPr>
+              <w:noProof/>
+              <w:kern w:val="2"/>
+              <w:sz w:val="24"/>
+              <w:szCs w:val="24"/>
+              <w:lang w:val="es-MX" w:eastAsia="es-MX"/>
+              <w14:ligatures w14:val="standardContextual"/>
+            </w:rPr>
+          </w:pPr>
+          <w:hyperlink w:anchor="_Toc229992088" w:history="1">
+            <w:r>
+              <w:rPr>
+                <w:rStyle w:val="Hipervnculo"/>
+                <w:noProof/>
+              </w:rPr>
+              <w:t>Referencias</w:t>
+            </w:r>
+            <w:r>
+              <w:rPr>
+                <w:noProof/>
+                <w:webHidden/>
+              </w:rPr>
+              <w:tab/>
+            </w:r>
+            <w:r>
+              <w:rPr>
+                <w:noProof/>
+                <w:webHidden/>
+              </w:rPr>
+              <w:fldChar w:fldCharType="begin"/>
+            </w:r>
+            <w:r>
+              <w:rPr>
+                <w:noProof/>
+                <w:webHidden/>
+              </w:rPr>
+              <w:instrText xml:space="preserve"> PAGEREF _Toc229992088 \h </w:instrText>
+            </w:r>
+            <w:r>
+              <w:rPr>
+                <w:noProof/>
+                <w:webHidden/>
+              </w:rPr>
+            </w:r>
+            <w:r>
+              <w:rPr>
+                <w:noProof/>
+                <w:webHidden/>
+              </w:rPr>
+              <w:fldChar w:fldCharType="separate"/>
+            </w:r>
+            <w:r>
+              <w:rPr>
+                <w:noProof/>
+                <w:webHidden/>
+              </w:rPr>
+              <w:t>13</w:t>
+            </w:r>
+            <w:r>
+              <w:rPr>
+                <w:noProof/>
+                <w:webHidden/>
+              </w:rPr>
+              <w:fldChar w:fldCharType="end"/>
+            </w:r>
+          </w:hyperlink>
+        </w:p>
+        <w:p>
           <w:r>
             <w:fldChar w:fldCharType="end"/>
           </w:r>
@@ -1203,7 +1262,7 @@
           <w:lang w:val="es-MX"/>
         </w:rPr>
       </w:pPr>
-      <w:bookmarkStart w:id="0" w:name="_Toc229916823"/>
+      <w:bookmarkStart w:id="0" w:name="_Toc229992082"/>
       <w:r>
         <w:rPr>
           <w:lang w:val="es-MX"/>
@@ -3052,7 +3111,7 @@
       <w:pPr>
         <w:pStyle w:val="Ttulo1"/>
       </w:pPr>
-      <w:bookmarkStart w:id="1" w:name="_Toc229916824"/>
+      <w:bookmarkStart w:id="1" w:name="_Toc229992083"/>
       <w:r>
         <w:t xml:space="preserve">Arquitectura MVT (Model View </w:t>
       </w:r>
@@ -6325,7 +6384,7 @@
           <w:lang w:val="es-MX"/>
         </w:rPr>
       </w:pPr>
-      <w:bookmarkStart w:id="2" w:name="_Toc229916825"/>
+      <w:bookmarkStart w:id="2" w:name="_Toc229992084"/>
       <w:r>
         <w:rPr>
           <w:lang w:val="es-MX"/>
@@ -7464,7 +7523,7 @@
       <w:pPr>
         <w:pStyle w:val="Ttulo3"/>
       </w:pPr>
-      <w:bookmarkStart w:id="3" w:name="_Toc229916826"/>
+      <w:bookmarkStart w:id="3" w:name="_Toc229992085"/>
       <w:r>
         <w:lastRenderedPageBreak/>
         <w:t>Base de Datos SQLite</w:t>
@@ -8091,7 +8150,7 @@
           <w:color w:val="BBBEBF"/>
           <w:sz w:val="21"/>
           <w:szCs w:val="21"/>
-          <w:lang w:val="es-MX" w:eastAsia="es-MX"/>
+          <w:lang w:eastAsia="es-MX"/>
         </w:rPr>
       </w:pPr>
       <w:r>
@@ -8110,11 +8169,69 @@
           <w:color w:val="A5D6FF"/>
           <w:sz w:val="21"/>
           <w:szCs w:val="21"/>
-          <w:lang w:val="es-MX" w:eastAsia="es-MX"/>
+          <w:lang w:eastAsia="es-MX"/>
         </w:rPr>
         <w:t>'ENGINE'</w:t>
       </w:r>
       <w:r>
+        <w:rPr>
+          <w:rFonts w:ascii="Consolas" w:eastAsia="Times New Roman" w:hAnsi="Consolas" w:cs="Times New Roman"/>
+          <w:color w:val="BBBEBF"/>
+          <w:sz w:val="21"/>
+          <w:szCs w:val="21"/>
+          <w:lang w:eastAsia="es-MX"/>
+        </w:rPr>
+        <w:t xml:space="preserve">: </w:t>
+      </w:r>
+      <w:r>
+        <w:rPr>
+          <w:rFonts w:ascii="Consolas" w:eastAsia="Times New Roman" w:hAnsi="Consolas" w:cs="Times New Roman"/>
+          <w:color w:val="A5D6FF"/>
+          <w:sz w:val="21"/>
+          <w:szCs w:val="21"/>
+          <w:lang w:eastAsia="es-MX"/>
+        </w:rPr>
+        <w:t>'django.</w:t>
+      </w:r>
+      <w:proofErr w:type="gramStart"/>
+      <w:r>
+        <w:rPr>
+          <w:rFonts w:ascii="Consolas" w:eastAsia="Times New Roman" w:hAnsi="Consolas" w:cs="Times New Roman"/>
+          <w:color w:val="A5D6FF"/>
+          <w:sz w:val="21"/>
+          <w:szCs w:val="21"/>
+          <w:lang w:eastAsia="es-MX"/>
+        </w:rPr>
+        <w:t>db.backends</w:t>
+      </w:r>
+      <w:proofErr w:type="gramEnd"/>
+      <w:r>
+        <w:rPr>
+          <w:rFonts w:ascii="Consolas" w:eastAsia="Times New Roman" w:hAnsi="Consolas" w:cs="Times New Roman"/>
+          <w:color w:val="A5D6FF"/>
+          <w:sz w:val="21"/>
+          <w:szCs w:val="21"/>
+          <w:lang w:eastAsia="es-MX"/>
+        </w:rPr>
+        <w:t>.sqlite3'</w:t>
+      </w:r>
+      <w:r>
+        <w:rPr>
+          <w:rFonts w:ascii="Consolas" w:eastAsia="Times New Roman" w:hAnsi="Consolas" w:cs="Times New Roman"/>
+          <w:color w:val="BBBEBF"/>
+          <w:sz w:val="21"/>
+          <w:szCs w:val="21"/>
+          <w:lang w:eastAsia="es-MX"/>
+        </w:rPr>
+        <w:t>,</w:t>
+      </w:r>
+    </w:p>
+    <w:p>
+      <w:pPr>
+        <w:shd w:val="clear" w:color="auto" w:fill="121314"/>
+        <w:spacing w:after="0" w:line="285" w:lineRule="atLeast"/>
+        <w:ind w:left="720"/>
+        <w:jc w:val="left"/>
         <w:rPr>
           <w:rFonts w:ascii="Consolas" w:eastAsia="Times New Roman" w:hAnsi="Consolas" w:cs="Times New Roman"/>
           <w:color w:val="BBBEBF"/>
@@ -8122,72 +8239,14 @@
           <w:szCs w:val="21"/>
           <w:lang w:val="es-MX" w:eastAsia="es-MX"/>
         </w:rPr>
-        <w:t xml:space="preserve">: </w:t>
-      </w:r>
-      <w:r>
-        <w:rPr>
-          <w:rFonts w:ascii="Consolas" w:eastAsia="Times New Roman" w:hAnsi="Consolas" w:cs="Times New Roman"/>
-          <w:color w:val="A5D6FF"/>
-          <w:sz w:val="21"/>
-          <w:szCs w:val="21"/>
-          <w:lang w:val="es-MX" w:eastAsia="es-MX"/>
-        </w:rPr>
-        <w:t>'django.</w:t>
-      </w:r>
-      <w:proofErr w:type="gramStart"/>
-      <w:r>
-        <w:rPr>
-          <w:rFonts w:ascii="Consolas" w:eastAsia="Times New Roman" w:hAnsi="Consolas" w:cs="Times New Roman"/>
-          <w:color w:val="A5D6FF"/>
-          <w:sz w:val="21"/>
-          <w:szCs w:val="21"/>
-          <w:lang w:val="es-MX" w:eastAsia="es-MX"/>
-        </w:rPr>
-        <w:t>db.backends</w:t>
-      </w:r>
-      <w:proofErr w:type="gramEnd"/>
-      <w:r>
-        <w:rPr>
-          <w:rFonts w:ascii="Consolas" w:eastAsia="Times New Roman" w:hAnsi="Consolas" w:cs="Times New Roman"/>
-          <w:color w:val="A5D6FF"/>
-          <w:sz w:val="21"/>
-          <w:szCs w:val="21"/>
-          <w:lang w:val="es-MX" w:eastAsia="es-MX"/>
-        </w:rPr>
-        <w:t>.sqlite3'</w:t>
-      </w:r>
+      </w:pPr>
       <w:r>
         <w:rPr>
           <w:rFonts w:ascii="Consolas" w:eastAsia="Times New Roman" w:hAnsi="Consolas" w:cs="Times New Roman"/>
           <w:color w:val="BBBEBF"/>
           <w:sz w:val="21"/>
           <w:szCs w:val="21"/>
-          <w:lang w:val="es-MX" w:eastAsia="es-MX"/>
-        </w:rPr>
-        <w:t>,</w:t>
-      </w:r>
-    </w:p>
-    <w:p>
-      <w:pPr>
-        <w:shd w:val="clear" w:color="auto" w:fill="121314"/>
-        <w:spacing w:after="0" w:line="285" w:lineRule="atLeast"/>
-        <w:ind w:left="720"/>
-        <w:jc w:val="left"/>
-        <w:rPr>
-          <w:rFonts w:ascii="Consolas" w:eastAsia="Times New Roman" w:hAnsi="Consolas" w:cs="Times New Roman"/>
-          <w:color w:val="BBBEBF"/>
-          <w:sz w:val="21"/>
-          <w:szCs w:val="21"/>
-          <w:lang w:val="es-MX" w:eastAsia="es-MX"/>
-        </w:rPr>
-      </w:pPr>
-      <w:r>
-        <w:rPr>
-          <w:rFonts w:ascii="Consolas" w:eastAsia="Times New Roman" w:hAnsi="Consolas" w:cs="Times New Roman"/>
-          <w:color w:val="BBBEBF"/>
-          <w:sz w:val="21"/>
-          <w:szCs w:val="21"/>
-          <w:lang w:val="es-MX" w:eastAsia="es-MX"/>
+          <w:lang w:eastAsia="es-MX"/>
         </w:rPr>
         <w:t xml:space="preserve">        </w:t>
       </w:r>
@@ -8643,6 +8702,7 @@
       </w:pPr>
       <w:r>
         <w:rPr>
+          <w:noProof/>
           <w:lang w:val="es-MX"/>
         </w:rPr>
         <w:lastRenderedPageBreak/>
@@ -9326,6 +9386,7 @@
       </w:pPr>
       <w:r>
         <w:rPr>
+          <w:noProof/>
           <w:lang w:val="es-MX"/>
         </w:rPr>
         <w:drawing>
@@ -9374,6 +9435,7 @@
       </w:pPr>
       <w:r>
         <w:rPr>
+          <w:noProof/>
           <w:lang w:val="es-MX"/>
         </w:rPr>
         <w:drawing>
@@ -9622,7 +9684,7 @@
       <w:pPr>
         <w:pStyle w:val="Ttulo3"/>
       </w:pPr>
-      <w:bookmarkStart w:id="4" w:name="_Toc229916827"/>
+      <w:bookmarkStart w:id="4" w:name="_Toc229992086"/>
       <w:r>
         <w:t>Tipos de Relaciones entre Tablas: Uno a Muchos, Muchos a Muchos y Uno a Uno</w:t>
       </w:r>
@@ -9630,6 +9692,543 @@
     </w:p>
     <w:p>
       <w:pPr>
+        <w:rPr>
+          <w:lang w:val="es-ES"/>
+        </w:rPr>
+      </w:pPr>
+      <w:r>
+        <w:rPr>
+          <w:lang w:val="es-MX"/>
+        </w:rPr>
+        <w:t xml:space="preserve">La idea principal </w:t>
+      </w:r>
+      <w:r>
+        <w:rPr>
+          <w:lang w:val="es-MX"/>
+        </w:rPr>
+        <w:t xml:space="preserve">de las relaciones </w:t>
+      </w:r>
+      <w:r>
+        <w:rPr>
+          <w:lang w:val="es-MX"/>
+        </w:rPr>
+        <w:t xml:space="preserve">es representar </w:t>
+      </w:r>
+      <w:r>
+        <w:rPr>
+          <w:lang w:val="es-MX"/>
+        </w:rPr>
+        <w:t xml:space="preserve">conexiones </w:t>
+      </w:r>
+      <w:r>
+        <w:rPr>
+          <w:lang w:val="es-MX"/>
+        </w:rPr>
+        <w:t xml:space="preserve">reales del mundo </w:t>
+      </w:r>
+      <w:r>
+        <w:rPr>
+          <w:lang w:val="es-MX"/>
+        </w:rPr>
+        <w:t xml:space="preserve">entre objetos </w:t>
+      </w:r>
+      <w:r>
+        <w:rPr>
+          <w:lang w:val="es-MX"/>
+        </w:rPr>
+        <w:t xml:space="preserve">sin duplicar información. Por ejemplo, en vez de guardar el nombre completo de una editorial en cada libro, </w:t>
+      </w:r>
+      <w:r>
+        <w:rPr>
+          <w:lang w:val="es-MX"/>
+        </w:rPr>
+        <w:t xml:space="preserve">se </w:t>
+      </w:r>
+      <w:r>
+        <w:rPr>
+          <w:lang w:val="es-MX"/>
+        </w:rPr>
+        <w:t xml:space="preserve">guarda únicamente el id de la editorial. </w:t>
+      </w:r>
+      <w:r>
+        <w:rPr>
+          <w:lang w:val="es-MX"/>
+        </w:rPr>
+        <w:t>Así, múltiples libros pueden apuntar a la misma editorial.</w:t>
+      </w:r>
+    </w:p>
+    <w:p>
+      <w:pPr>
+        <w:pStyle w:val="Prrafodelista"/>
+        <w:numPr>
+          <w:ilvl w:val="0"/>
+          <w:numId w:val="5"/>
+        </w:numPr>
+        <w:rPr>
+          <w:lang w:val="es-MX"/>
+        </w:rPr>
+      </w:pPr>
+      <w:r>
+        <w:rPr>
+          <w:b/>
+          <w:bCs/>
+          <w:lang w:val="es-ES"/>
+        </w:rPr>
+        <w:t>Llave foránea (Foreign Key):</w:t>
+      </w:r>
+      <w:r>
+        <w:rPr>
+          <w:lang w:val="es-ES"/>
+        </w:rPr>
+        <w:t xml:space="preserve"> </w:t>
+      </w:r>
+      <w:r>
+        <w:rPr>
+          <w:lang w:val="es-MX"/>
+        </w:rPr>
+        <w:t>E</w:t>
+      </w:r>
+      <w:r>
+        <w:rPr>
+          <w:lang w:val="es-MX"/>
+        </w:rPr>
+        <w:t>s simplemente una columna que apunta al id de otra tabla para crear una relación entre ambas</w:t>
+      </w:r>
+      <w:r>
+        <w:rPr>
+          <w:lang w:val="es-MX"/>
+        </w:rPr>
+        <w:t>, teniendo en cuenta que l</w:t>
+      </w:r>
+      <w:r>
+        <w:rPr>
+          <w:lang w:val="es-MX"/>
+        </w:rPr>
+        <w:t xml:space="preserve">a </w:t>
+      </w:r>
+      <w:r>
+        <w:rPr>
+          <w:b/>
+          <w:bCs/>
+          <w:lang w:val="es-MX"/>
+        </w:rPr>
+        <w:t>Foreign Key SIEMPRE</w:t>
+      </w:r>
+      <w:r>
+        <w:rPr>
+          <w:lang w:val="es-MX"/>
+        </w:rPr>
+        <w:t xml:space="preserve"> va en</w:t>
+      </w:r>
+      <w:r>
+        <w:rPr>
+          <w:lang w:val="es-MX"/>
+        </w:rPr>
+        <w:t xml:space="preserve"> l</w:t>
+      </w:r>
+      <w:r>
+        <w:rPr>
+          <w:lang w:val="es-MX"/>
+        </w:rPr>
+        <w:t>a tabla que pertenece o depende de la otra.</w:t>
+      </w:r>
+    </w:p>
+    <w:p>
+      <w:pPr>
+        <w:pStyle w:val="Prrafodelista"/>
+        <w:numPr>
+          <w:ilvl w:val="1"/>
+          <w:numId w:val="5"/>
+        </w:numPr>
+        <w:rPr>
+          <w:b/>
+          <w:bCs/>
+          <w:lang w:val="es-MX"/>
+        </w:rPr>
+      </w:pPr>
+      <w:r>
+        <w:rPr>
+          <w:lang w:val="es-ES"/>
+        </w:rPr>
+        <w:t xml:space="preserve">La forma de diseñar las bases de datos en cuestión de sus relaciones es resolver la pregunta de, </w:t>
+      </w:r>
+      <w:r>
+        <w:rPr>
+          <w:b/>
+          <w:bCs/>
+          <w:lang w:val="es-MX"/>
+        </w:rPr>
+        <w:t>¿Cuántos de A pueden relacionarse con B?</w:t>
+      </w:r>
+      <w:r>
+        <w:rPr>
+          <w:lang w:val="es-MX"/>
+        </w:rPr>
+        <w:t xml:space="preserve"> A esto se le llama </w:t>
+      </w:r>
+      <w:r>
+        <w:rPr>
+          <w:b/>
+          <w:bCs/>
+          <w:lang w:val="es-MX"/>
+        </w:rPr>
+        <w:t>cardinalidad</w:t>
+      </w:r>
+      <w:r>
+        <w:rPr>
+          <w:lang w:val="es-MX"/>
+        </w:rPr>
+        <w:t>.</w:t>
+      </w:r>
+    </w:p>
+    <w:p>
+      <w:pPr>
+        <w:pStyle w:val="Prrafodelista"/>
+        <w:numPr>
+          <w:ilvl w:val="2"/>
+          <w:numId w:val="5"/>
+        </w:numPr>
+        <w:rPr>
+          <w:lang w:val="es-MX"/>
+        </w:rPr>
+      </w:pPr>
+      <w:r>
+        <w:rPr>
+          <w:b/>
+          <w:bCs/>
+          <w:lang w:val="es-MX"/>
+        </w:rPr>
+        <w:lastRenderedPageBreak/>
+        <w:t>Un A tiene muchos B</w:t>
+      </w:r>
+      <w:r>
+        <w:rPr>
+          <w:b/>
+          <w:bCs/>
+          <w:lang w:val="es-MX"/>
+        </w:rPr>
+        <w:t xml:space="preserve"> - </w:t>
+      </w:r>
+      <w:proofErr w:type="spellStart"/>
+      <w:r>
+        <w:rPr>
+          <w:b/>
+          <w:bCs/>
+          <w:lang w:val="es-MX"/>
+        </w:rPr>
+        <w:t>One</w:t>
+      </w:r>
+      <w:proofErr w:type="spellEnd"/>
+      <w:r>
+        <w:rPr>
+          <w:b/>
+          <w:bCs/>
+          <w:lang w:val="es-MX"/>
+        </w:rPr>
+        <w:t>-</w:t>
+      </w:r>
+      <w:proofErr w:type="spellStart"/>
+      <w:r>
+        <w:rPr>
+          <w:b/>
+          <w:bCs/>
+          <w:lang w:val="es-MX"/>
+        </w:rPr>
+        <w:t>to</w:t>
+      </w:r>
+      <w:proofErr w:type="spellEnd"/>
+      <w:r>
+        <w:rPr>
+          <w:b/>
+          <w:bCs/>
+          <w:lang w:val="es-MX"/>
+        </w:rPr>
+        <w:t>-Many</w:t>
+      </w:r>
+      <w:r>
+        <w:rPr>
+          <w:b/>
+          <w:bCs/>
+          <w:lang w:val="es-MX"/>
+        </w:rPr>
+        <w:t>:</w:t>
+      </w:r>
+      <w:r>
+        <w:rPr>
+          <w:lang w:val="es-MX"/>
+        </w:rPr>
+        <w:t xml:space="preserve"> </w:t>
+      </w:r>
+      <w:r>
+        <w:rPr>
+          <w:lang w:val="es-MX"/>
+        </w:rPr>
+        <w:t>Es una relación donde un registro</w:t>
+      </w:r>
+      <w:r>
+        <w:rPr>
+          <w:lang w:val="es-MX"/>
+        </w:rPr>
+        <w:t xml:space="preserve"> (fila)</w:t>
+      </w:r>
+      <w:r>
+        <w:rPr>
+          <w:lang w:val="es-MX"/>
+        </w:rPr>
+        <w:t xml:space="preserve"> de una tabla </w:t>
+      </w:r>
+      <w:r>
+        <w:rPr>
+          <w:lang w:val="es-MX"/>
+        </w:rPr>
+        <w:t xml:space="preserve">(clase) </w:t>
+      </w:r>
+      <w:r>
+        <w:rPr>
+          <w:lang w:val="es-MX"/>
+        </w:rPr>
+        <w:t xml:space="preserve">puede estar relacionado con muchos registros </w:t>
+      </w:r>
+      <w:r>
+        <w:rPr>
+          <w:lang w:val="es-MX"/>
+        </w:rPr>
+        <w:t xml:space="preserve">(muchas filas de datos) </w:t>
+      </w:r>
+      <w:r>
+        <w:rPr>
+          <w:lang w:val="es-MX"/>
+        </w:rPr>
+        <w:t>de otra tabla. Se utiliza cuando existe una jerarquía o dependencia clara, como una editorial con muchos libros o una empresa con muchos empleados.</w:t>
+      </w:r>
+    </w:p>
+    <w:p>
+      <w:pPr>
+        <w:pStyle w:val="Prrafodelista"/>
+        <w:numPr>
+          <w:ilvl w:val="2"/>
+          <w:numId w:val="5"/>
+        </w:numPr>
+        <w:rPr>
+          <w:b/>
+          <w:bCs/>
+          <w:lang w:val="es-MX"/>
+        </w:rPr>
+      </w:pPr>
+      <w:r>
+        <w:rPr>
+          <w:b/>
+          <w:bCs/>
+          <w:lang w:val="es-MX"/>
+        </w:rPr>
+        <w:t>Un A tiene un solo B</w:t>
+      </w:r>
+      <w:r>
+        <w:rPr>
+          <w:b/>
+          <w:bCs/>
+          <w:lang w:val="es-MX"/>
+        </w:rPr>
+        <w:t xml:space="preserve"> </w:t>
+      </w:r>
+      <w:r>
+        <w:rPr>
+          <w:b/>
+          <w:bCs/>
+          <w:lang w:val="es-MX"/>
+        </w:rPr>
+        <w:t xml:space="preserve">- </w:t>
+      </w:r>
+      <w:proofErr w:type="spellStart"/>
+      <w:r>
+        <w:rPr>
+          <w:b/>
+          <w:bCs/>
+          <w:lang w:val="es-MX"/>
+        </w:rPr>
+        <w:t>One-to-One</w:t>
+      </w:r>
+      <w:proofErr w:type="spellEnd"/>
+      <w:r>
+        <w:rPr>
+          <w:b/>
+          <w:bCs/>
+          <w:lang w:val="es-MX"/>
+        </w:rPr>
+        <w:t>:</w:t>
+      </w:r>
+      <w:r>
+        <w:rPr>
+          <w:lang w:val="es-MX"/>
+        </w:rPr>
+        <w:t xml:space="preserve"> </w:t>
+      </w:r>
+      <w:r>
+        <w:rPr>
+          <w:lang w:val="es-MX"/>
+        </w:rPr>
+        <w:t xml:space="preserve">Es una relación donde un registro solo puede relacionarse con un único registro de la otra tabla, y viceversa. Se utiliza normalmente para separar información opcional, sensible o extendida de una entidad principal, como un usuario y su perfil o una persona y su pasaporte. </w:t>
+      </w:r>
+    </w:p>
+    <w:p>
+      <w:pPr>
+        <w:pStyle w:val="Prrafodelista"/>
+        <w:numPr>
+          <w:ilvl w:val="2"/>
+          <w:numId w:val="5"/>
+        </w:numPr>
+        <w:rPr>
+          <w:lang w:val="es-MX"/>
+        </w:rPr>
+      </w:pPr>
+      <w:r>
+        <w:rPr>
+          <w:b/>
+          <w:bCs/>
+          <w:lang w:val="es-MX"/>
+        </w:rPr>
+        <w:t>Muchos A tienen muchos B</w:t>
+      </w:r>
+      <w:r>
+        <w:rPr>
+          <w:b/>
+          <w:bCs/>
+          <w:lang w:val="es-MX"/>
+        </w:rPr>
+        <w:t xml:space="preserve"> - </w:t>
+      </w:r>
+      <w:r>
+        <w:rPr>
+          <w:b/>
+          <w:bCs/>
+          <w:lang w:val="es-MX"/>
+        </w:rPr>
+        <w:t>Many-</w:t>
+      </w:r>
+      <w:proofErr w:type="spellStart"/>
+      <w:r>
+        <w:rPr>
+          <w:b/>
+          <w:bCs/>
+          <w:lang w:val="es-MX"/>
+        </w:rPr>
+        <w:t>to</w:t>
+      </w:r>
+      <w:proofErr w:type="spellEnd"/>
+      <w:r>
+        <w:rPr>
+          <w:b/>
+          <w:bCs/>
+          <w:lang w:val="es-MX"/>
+        </w:rPr>
+        <w:t>-Many</w:t>
+      </w:r>
+      <w:r>
+        <w:rPr>
+          <w:b/>
+          <w:bCs/>
+          <w:lang w:val="es-MX"/>
+        </w:rPr>
+        <w:t>:</w:t>
+      </w:r>
+      <w:r>
+        <w:rPr>
+          <w:lang w:val="es-MX"/>
+        </w:rPr>
+        <w:t xml:space="preserve"> </w:t>
+      </w:r>
+      <w:r>
+        <w:rPr>
+          <w:lang w:val="es-MX"/>
+        </w:rPr>
+        <w:t xml:space="preserve">Es una relación donde múltiples registros de una tabla pueden relacionarse con múltiples registros de otra tabla al mismo tiempo. Como una sola Foreign Key no </w:t>
+      </w:r>
+      <w:r>
+        <w:rPr>
+          <w:lang w:val="es-MX"/>
+        </w:rPr>
+        <w:t xml:space="preserve">se </w:t>
+      </w:r>
+      <w:r>
+        <w:rPr>
+          <w:lang w:val="es-MX"/>
+        </w:rPr>
+        <w:t>puede representar esta conexión, se crea una tabla intermedia que almacena las relaciones entre ambas entidades. Se utiliza en escenarios como libros con varios autores, estudiantes inscritos en varios cursos o productos pertenecientes a múltiples categorías</w:t>
+      </w:r>
+      <w:r>
+        <w:rPr>
+          <w:lang w:val="es-MX"/>
+        </w:rPr>
+        <w:t xml:space="preserve">, en Python esta tabla nueva se crea al utilizar la </w:t>
+      </w:r>
+      <w:proofErr w:type="spellStart"/>
+      <w:r>
+        <w:rPr>
+          <w:lang w:val="es-MX"/>
+        </w:rPr>
+        <w:t>foreign</w:t>
+      </w:r>
+      <w:proofErr w:type="spellEnd"/>
+      <w:r>
+        <w:rPr>
+          <w:lang w:val="es-MX"/>
+        </w:rPr>
+        <w:t xml:space="preserve"> </w:t>
+      </w:r>
+      <w:proofErr w:type="spellStart"/>
+      <w:r>
+        <w:rPr>
+          <w:lang w:val="es-MX"/>
+        </w:rPr>
+        <w:t>key</w:t>
+      </w:r>
+      <w:proofErr w:type="spellEnd"/>
+      <w:r>
+        <w:rPr>
+          <w:lang w:val="es-MX"/>
+        </w:rPr>
+        <w:t xml:space="preserve"> de tipo </w:t>
+      </w:r>
+      <w:proofErr w:type="spellStart"/>
+      <w:proofErr w:type="gramStart"/>
+      <w:r>
+        <w:rPr>
+          <w:rFonts w:ascii="Consolas" w:eastAsia="Times New Roman" w:hAnsi="Consolas" w:cs="Times New Roman"/>
+          <w:color w:val="4EC9B0"/>
+          <w:sz w:val="20"/>
+          <w:lang w:val="es-MX" w:eastAsia="es-MX"/>
+        </w:rPr>
+        <w:t>models</w:t>
+      </w:r>
+      <w:r>
+        <w:rPr>
+          <w:rFonts w:ascii="Consolas" w:eastAsia="Times New Roman" w:hAnsi="Consolas" w:cs="Times New Roman"/>
+          <w:color w:val="BBBEBF"/>
+          <w:sz w:val="20"/>
+          <w:lang w:val="es-MX" w:eastAsia="es-MX"/>
+        </w:rPr>
+        <w:t>.</w:t>
+      </w:r>
+      <w:r>
+        <w:rPr>
+          <w:rFonts w:ascii="Consolas" w:eastAsia="Times New Roman" w:hAnsi="Consolas" w:cs="Times New Roman"/>
+          <w:color w:val="4EC9B0"/>
+          <w:sz w:val="20"/>
+          <w:lang w:val="es-MX" w:eastAsia="es-MX"/>
+        </w:rPr>
+        <w:t>ManyToManyField</w:t>
+      </w:r>
+      <w:proofErr w:type="spellEnd"/>
+      <w:proofErr w:type="gramEnd"/>
+      <w:r>
+        <w:rPr>
+          <w:lang w:val="es-MX"/>
+        </w:rPr>
+        <w:t>.</w:t>
+      </w:r>
+    </w:p>
+    <w:p>
+      <w:pPr>
         <w:jc w:val="center"/>
         <w:rPr>
           <w:lang w:val="es-MX"/>
@@ -9637,6 +10236,7 @@
       </w:pPr>
       <w:r>
         <w:rPr>
+          <w:noProof/>
           <w:lang w:val="es-MX"/>
         </w:rPr>
         <w:drawing>
@@ -9685,9 +10285,9 @@
       </w:pPr>
       <w:r>
         <w:rPr>
-          <w:lang w:val="es-MX"/>
-        </w:rPr>
-        <w:lastRenderedPageBreak/>
+          <w:noProof/>
+          <w:lang w:val="es-MX"/>
+        </w:rPr>
         <w:drawing>
           <wp:inline distT="0" distB="0" distL="0" distR="0" wp14:anchorId="04B08112" wp14:editId="7361C81A">
             <wp:extent cx="5943600" cy="1563370"/>
@@ -9734,27 +10334,303 @@
     </w:p>
     <w:p>
       <w:pPr>
-        <w:rPr>
-          <w:lang w:val="es-MX"/>
-        </w:rPr>
-      </w:pPr>
+        <w:pStyle w:val="Ttulo3"/>
+      </w:pPr>
+      <w:bookmarkStart w:id="5" w:name="_Toc229992087"/>
+      <w:r>
+        <w:t xml:space="preserve">URLs.py: Archivo de Configuración de </w:t>
+      </w:r>
+      <w:proofErr w:type="spellStart"/>
+      <w:r>
+        <w:t>Endpoints</w:t>
+      </w:r>
+      <w:bookmarkEnd w:id="5"/>
+      <w:proofErr w:type="spellEnd"/>
     </w:p>
     <w:p>
       <w:pPr>
         <w:rPr>
-          <w:lang w:val="es-MX"/>
-        </w:rPr>
-      </w:pPr>
+          <w:lang w:val="es-ES"/>
+        </w:rPr>
+      </w:pPr>
+      <w:r>
+        <w:rPr>
+          <w:lang w:val="es-ES"/>
+        </w:rPr>
+        <w:t xml:space="preserve">Ya existe un archivo predeterminado dentro de la carpeta </w:t>
+      </w:r>
+      <w:proofErr w:type="spellStart"/>
+      <w:r>
+        <w:rPr>
+          <w:b/>
+          <w:bCs/>
+          <w:lang w:val="es-ES"/>
+        </w:rPr>
+        <w:t>a_first_proyect</w:t>
+      </w:r>
+      <w:proofErr w:type="spellEnd"/>
+      <w:r>
+        <w:rPr>
+          <w:b/>
+          <w:bCs/>
+          <w:lang w:val="es-ES"/>
+        </w:rPr>
+        <w:t>/</w:t>
+      </w:r>
+      <w:proofErr w:type="spellStart"/>
+      <w:r>
+        <w:rPr>
+          <w:b/>
+          <w:bCs/>
+          <w:lang w:val="es-ES"/>
+        </w:rPr>
+        <w:t>a_first_proyect</w:t>
+      </w:r>
+      <w:proofErr w:type="spellEnd"/>
+      <w:r>
+        <w:rPr>
+          <w:b/>
+          <w:bCs/>
+          <w:lang w:val="es-ES"/>
+        </w:rPr>
+        <w:t>/</w:t>
+      </w:r>
+      <w:r>
+        <w:rPr>
+          <w:b/>
+          <w:bCs/>
+          <w:color w:val="00B0F0"/>
+          <w:lang w:val="es-ES"/>
+        </w:rPr>
+        <w:t>urls.py</w:t>
+      </w:r>
+      <w:r>
+        <w:rPr>
+          <w:lang w:val="es-ES"/>
+        </w:rPr>
+        <w:t xml:space="preserve">, donde se utiliza la librería </w:t>
+      </w:r>
+      <w:proofErr w:type="spellStart"/>
+      <w:r>
+        <w:rPr>
+          <w:lang w:val="es-ES"/>
+        </w:rPr>
+        <w:t>Django.urls</w:t>
+      </w:r>
+      <w:proofErr w:type="spellEnd"/>
+      <w:r>
+        <w:rPr>
+          <w:lang w:val="es-ES"/>
+        </w:rPr>
+        <w:t xml:space="preserve">, la cual sirve para añadir los </w:t>
+      </w:r>
+      <w:proofErr w:type="spellStart"/>
+      <w:r>
+        <w:rPr>
+          <w:lang w:val="es-ES"/>
+        </w:rPr>
+        <w:t>endpoints</w:t>
+      </w:r>
+      <w:proofErr w:type="spellEnd"/>
+      <w:r>
+        <w:rPr>
+          <w:lang w:val="es-ES"/>
+        </w:rPr>
+        <w:t xml:space="preserve"> que serán desplegados hacia el usuario, ayudando así que los </w:t>
+      </w:r>
+      <w:proofErr w:type="spellStart"/>
+      <w:r>
+        <w:rPr>
+          <w:lang w:val="es-ES"/>
+        </w:rPr>
+        <w:t>templates</w:t>
+      </w:r>
+      <w:proofErr w:type="spellEnd"/>
+      <w:r>
+        <w:rPr>
+          <w:lang w:val="es-ES"/>
+        </w:rPr>
+        <w:t xml:space="preserve"> (interfaz de usuario o UI) y las vistas del archivo </w:t>
+      </w:r>
+      <w:r>
+        <w:rPr>
+          <w:b/>
+          <w:bCs/>
+          <w:lang w:val="es-ES"/>
+        </w:rPr>
+        <w:t>a_first_proyect/a_</w:t>
+      </w:r>
+      <w:r>
+        <w:rPr>
+          <w:b/>
+          <w:bCs/>
+          <w:lang w:val="es-ES"/>
+        </w:rPr>
+        <w:t>app_name</w:t>
+      </w:r>
+      <w:r>
+        <w:rPr>
+          <w:b/>
+          <w:bCs/>
+          <w:lang w:val="es-ES"/>
+        </w:rPr>
+        <w:t>/</w:t>
+      </w:r>
+      <w:r>
+        <w:rPr>
+          <w:b/>
+          <w:bCs/>
+          <w:color w:val="00B0F0"/>
+          <w:lang w:val="es-ES"/>
+        </w:rPr>
+        <w:t>views</w:t>
+      </w:r>
+      <w:r>
+        <w:rPr>
+          <w:b/>
+          <w:bCs/>
+          <w:color w:val="00B0F0"/>
+          <w:lang w:val="es-ES"/>
+        </w:rPr>
+        <w:t>.py</w:t>
+      </w:r>
+      <w:r>
+        <w:rPr>
+          <w:color w:val="00B0F0"/>
+          <w:lang w:val="es-ES"/>
+        </w:rPr>
+        <w:t xml:space="preserve"> </w:t>
+      </w:r>
+      <w:r>
+        <w:rPr>
+          <w:lang w:val="es-ES"/>
+        </w:rPr>
+        <w:t xml:space="preserve">puedan conectarse a las bases de datos y mostrarlos cuando se hagan </w:t>
+      </w:r>
+      <w:proofErr w:type="spellStart"/>
+      <w:r>
+        <w:rPr>
+          <w:lang w:val="es-ES"/>
+        </w:rPr>
+        <w:t>requests</w:t>
+      </w:r>
+      <w:proofErr w:type="spellEnd"/>
+      <w:r>
+        <w:rPr>
+          <w:lang w:val="es-ES"/>
+        </w:rPr>
+        <w:t xml:space="preserve"> a los diferentes elementos de las páginas, renderizando así su información, pero hay una recomendación de buenas prácticas que indican que las </w:t>
+      </w:r>
+      <w:proofErr w:type="spellStart"/>
+      <w:r>
+        <w:rPr>
+          <w:lang w:val="es-ES"/>
+        </w:rPr>
+        <w:t>URLs</w:t>
+      </w:r>
+      <w:proofErr w:type="spellEnd"/>
+      <w:r>
+        <w:rPr>
+          <w:lang w:val="es-ES"/>
+        </w:rPr>
+        <w:t xml:space="preserve"> deben estar agrupadas por aplicación, para </w:t>
+      </w:r>
+      <w:r>
+        <w:rPr>
+          <w:lang w:val="es-ES"/>
+        </w:rPr>
+        <w:lastRenderedPageBreak/>
+        <w:t xml:space="preserve">así tener todos sus </w:t>
+      </w:r>
+      <w:proofErr w:type="spellStart"/>
+      <w:r>
+        <w:rPr>
+          <w:lang w:val="es-ES"/>
+        </w:rPr>
+        <w:t>endpoints</w:t>
+      </w:r>
+      <w:proofErr w:type="spellEnd"/>
+      <w:r>
+        <w:rPr>
+          <w:lang w:val="es-ES"/>
+        </w:rPr>
+        <w:t xml:space="preserve"> centralizados, para ello se creará un nuevo archivo desde cero en el directorio de </w:t>
+      </w:r>
+      <w:r>
+        <w:rPr>
+          <w:b/>
+          <w:bCs/>
+          <w:lang w:val="es-ES"/>
+        </w:rPr>
+        <w:t>a_first_proyect/a_</w:t>
+      </w:r>
+      <w:r>
+        <w:rPr>
+          <w:b/>
+          <w:bCs/>
+          <w:lang w:val="es-ES"/>
+        </w:rPr>
+        <w:t>app_name</w:t>
+      </w:r>
+      <w:r>
+        <w:rPr>
+          <w:b/>
+          <w:bCs/>
+          <w:lang w:val="es-ES"/>
+        </w:rPr>
+        <w:t>/</w:t>
+      </w:r>
+      <w:r>
+        <w:rPr>
+          <w:b/>
+          <w:bCs/>
+          <w:color w:val="00B0F0"/>
+          <w:lang w:val="es-ES"/>
+        </w:rPr>
+        <w:t>url</w:t>
+      </w:r>
+      <w:r>
+        <w:rPr>
+          <w:b/>
+          <w:bCs/>
+          <w:color w:val="00B0F0"/>
+          <w:lang w:val="es-ES"/>
+        </w:rPr>
+        <w:t>s</w:t>
+      </w:r>
+      <w:r>
+        <w:rPr>
+          <w:b/>
+          <w:bCs/>
+          <w:color w:val="00B0F0"/>
+          <w:lang w:val="es-ES"/>
+        </w:rPr>
+        <w:t>.py</w:t>
+      </w:r>
     </w:p>
     <w:p>
       <w:pPr>
+        <w:rPr>
+          <w:lang w:val="es-ES"/>
+        </w:rPr>
+      </w:pPr>
+    </w:p>
+    <w:p>
+      <w:pPr>
+        <w:rPr>
+          <w:lang w:val="es-MX"/>
+        </w:rPr>
+      </w:pPr>
+    </w:p>
+    <w:p>
+      <w:pPr>
         <w:pStyle w:val="Ttulo1"/>
       </w:pPr>
-      <w:bookmarkStart w:id="5" w:name="_Toc229916828"/>
+      <w:bookmarkStart w:id="6" w:name="_Toc229992088"/>
       <w:r>
         <w:t>Referencias</w:t>
       </w:r>
-      <w:bookmarkEnd w:id="5"/>
+      <w:bookmarkEnd w:id="6"/>
     </w:p>
     <w:p>
       <w:pPr>
@@ -10537,6 +11413,119 @@
       </w:rPr>
     </w:lvl>
   </w:abstractNum>
+  <w:abstractNum w:abstractNumId="4" w15:restartNumberingAfterBreak="0">
+    <w:nsid w:val="5D764975"/>
+    <w:multiLevelType w:val="hybridMultilevel"/>
+    <w:tmpl w:val="C53E4D5E"/>
+    <w:lvl w:ilvl="0" w:tplc="080A0001">
+      <w:start w:val="1"/>
+      <w:numFmt w:val="bullet"/>
+      <w:lvlText w:val=""/>
+      <w:lvlJc w:val="left"/>
+      <w:pPr>
+        <w:ind w:left="720" w:hanging="360"/>
+      </w:pPr>
+      <w:rPr>
+        <w:rFonts w:ascii="Symbol" w:hAnsi="Symbol" w:hint="default"/>
+      </w:rPr>
+    </w:lvl>
+    <w:lvl w:ilvl="1" w:tplc="080A0003">
+      <w:start w:val="1"/>
+      <w:numFmt w:val="bullet"/>
+      <w:lvlText w:val="o"/>
+      <w:lvlJc w:val="left"/>
+      <w:pPr>
+        <w:ind w:left="1440" w:hanging="360"/>
+      </w:pPr>
+      <w:rPr>
+        <w:rFonts w:ascii="Courier New" w:hAnsi="Courier New" w:cs="Courier New" w:hint="default"/>
+      </w:rPr>
+    </w:lvl>
+    <w:lvl w:ilvl="2" w:tplc="080A0005">
+      <w:start w:val="1"/>
+      <w:numFmt w:val="bullet"/>
+      <w:lvlText w:val=""/>
+      <w:lvlJc w:val="left"/>
+      <w:pPr>
+        <w:ind w:left="2160" w:hanging="360"/>
+      </w:pPr>
+      <w:rPr>
+        <w:rFonts w:ascii="Wingdings" w:hAnsi="Wingdings" w:hint="default"/>
+      </w:rPr>
+    </w:lvl>
+    <w:lvl w:ilvl="3" w:tplc="080A0001" w:tentative="1">
+      <w:start w:val="1"/>
+      <w:numFmt w:val="bullet"/>
+      <w:lvlText w:val=""/>
+      <w:lvlJc w:val="left"/>
+      <w:pPr>
+        <w:ind w:left="2880" w:hanging="360"/>
+      </w:pPr>
+      <w:rPr>
+        <w:rFonts w:ascii="Symbol" w:hAnsi="Symbol" w:hint="default"/>
+      </w:rPr>
+    </w:lvl>
+    <w:lvl w:ilvl="4" w:tplc="080A0003" w:tentative="1">
+      <w:start w:val="1"/>
+      <w:numFmt w:val="bullet"/>
+      <w:lvlText w:val="o"/>
+      <w:lvlJc w:val="left"/>
+      <w:pPr>
+        <w:ind w:left="3600" w:hanging="360"/>
+      </w:pPr>
+      <w:rPr>
+        <w:rFonts w:ascii="Courier New" w:hAnsi="Courier New" w:cs="Courier New" w:hint="default"/>
+      </w:rPr>
+    </w:lvl>
+    <w:lvl w:ilvl="5" w:tplc="080A0005" w:tentative="1">
+      <w:start w:val="1"/>
+      <w:numFmt w:val="bullet"/>
+      <w:lvlText w:val=""/>
+      <w:lvlJc w:val="left"/>
+      <w:pPr>
+        <w:ind w:left="4320" w:hanging="360"/>
+      </w:pPr>
+      <w:rPr>
+        <w:rFonts w:ascii="Wingdings" w:hAnsi="Wingdings" w:hint="default"/>
+      </w:rPr>
+    </w:lvl>
+    <w:lvl w:ilvl="6" w:tplc="080A0001" w:tentative="1">
+      <w:start w:val="1"/>
+      <w:numFmt w:val="bullet"/>
+      <w:lvlText w:val=""/>
+      <w:lvlJc w:val="left"/>
+      <w:pPr>
+        <w:ind w:left="5040" w:hanging="360"/>
+      </w:pPr>
+      <w:rPr>
+        <w:rFonts w:ascii="Symbol" w:hAnsi="Symbol" w:hint="default"/>
+      </w:rPr>
+    </w:lvl>
+    <w:lvl w:ilvl="7" w:tplc="080A0003" w:tentative="1">
+      <w:start w:val="1"/>
+      <w:numFmt w:val="bullet"/>
+      <w:lvlText w:val="o"/>
+      <w:lvlJc w:val="left"/>
+      <w:pPr>
+        <w:ind w:left="5760" w:hanging="360"/>
+      </w:pPr>
+      <w:rPr>
+        <w:rFonts w:ascii="Courier New" w:hAnsi="Courier New" w:cs="Courier New" w:hint="default"/>
+      </w:rPr>
+    </w:lvl>
+    <w:lvl w:ilvl="8" w:tplc="080A0005" w:tentative="1">
+      <w:start w:val="1"/>
+      <w:numFmt w:val="bullet"/>
+      <w:lvlText w:val=""/>
+      <w:lvlJc w:val="left"/>
+      <w:pPr>
+        <w:ind w:left="6480" w:hanging="360"/>
+      </w:pPr>
+      <w:rPr>
+        <w:rFonts w:ascii="Wingdings" w:hAnsi="Wingdings" w:hint="default"/>
+      </w:rPr>
+    </w:lvl>
+  </w:abstractNum>
   <w:num w:numId="1" w16cid:durableId="1473790873">
     <w:abstractNumId w:val="0"/>
   </w:num>
@@ -10548,6 +11537,9 @@
   </w:num>
   <w:num w:numId="4" w16cid:durableId="383334827">
     <w:abstractNumId w:val="1"/>
+  </w:num>
+  <w:num w:numId="5" w16cid:durableId="2142766872">
+    <w:abstractNumId w:val="4"/>
   </w:num>
   <w:numIdMacAtCleanup w:val="3"/>
 </w:numbering>
@@ -11008,7 +12000,6 @@
   <w:style w:type="character" w:default="1" w:styleId="Fuentedeprrafopredeter">
     <w:name w:val="Default Paragraph Font"/>
     <w:uiPriority w:val="1"/>
-    <w:semiHidden/>
     <w:unhideWhenUsed/>
   </w:style>
   <w:style w:type="table" w:default="1" w:styleId="Tablanormal">
@@ -11750,6 +12741,10 @@
 </file>
 
 <file path=customXml/item1.xml><?xml version="1.0" encoding="utf-8"?>
+<b:Sources xmlns:b="http://schemas.openxmlformats.org/officeDocument/2006/bibliography" xmlns="http://schemas.openxmlformats.org/officeDocument/2006/bibliography" SelectedStyle="\APASixthEditionOfficeOnline.xsl" StyleName="APA" Version="6"/>
+</file>
+
+<file path=customXml/item2.xml><?xml version="1.0" encoding="utf-8"?>
 <s:customData xmlns="http://www.wps.cn/officeDocument/2013/wpsCustomData" xmlns:s="http://www.wps.cn/officeDocument/2013/wpsCustomData">
   <customSectProps>
     <customSectPr/>
@@ -11760,22 +12755,18 @@
 </s:customData>
 </file>
 
-<file path=customXml/item2.xml><?xml version="1.0" encoding="utf-8"?>
-<b:Sources xmlns:b="http://schemas.openxmlformats.org/officeDocument/2006/bibliography" xmlns="http://schemas.openxmlformats.org/officeDocument/2006/bibliography" SelectedStyle="\APASixthEditionOfficeOnline.xsl" StyleName="APA" Version="6"/>
+<file path=customXml/itemProps1.xml><?xml version="1.0" encoding="utf-8"?>
+<ds:datastoreItem xmlns:ds="http://schemas.openxmlformats.org/officeDocument/2006/customXml" ds:itemID="{851A7482-30F0-4AF0-9C85-18995F48D7BA}">
+  <ds:schemaRefs>
+    <ds:schemaRef ds:uri="http://schemas.openxmlformats.org/officeDocument/2006/bibliography"/>
+  </ds:schemaRefs>
+</ds:datastoreItem>
 </file>
 
-<file path=customXml/itemProps1.xml><?xml version="1.0" encoding="utf-8"?>
+<file path=customXml/itemProps2.xml><?xml version="1.0" encoding="utf-8"?>
 <ds:datastoreItem xmlns:ds="http://schemas.openxmlformats.org/officeDocument/2006/customXml" ds:itemID="{B1977F7D-205B-4081-913C-38D41E755F92}">
   <ds:schemaRefs>
     <ds:schemaRef ds:uri="http://www.wps.cn/officeDocument/2013/wpsCustomData"/>
   </ds:schemaRefs>
 </ds:datastoreItem>
-</file>
-
-<file path=customXml/itemProps2.xml><?xml version="1.0" encoding="utf-8"?>
-<ds:datastoreItem xmlns:ds="http://schemas.openxmlformats.org/officeDocument/2006/customXml" ds:itemID="{851A7482-30F0-4AF0-9C85-18995F48D7BA}">
-  <ds:schemaRefs>
-    <ds:schemaRef ds:uri="http://schemas.openxmlformats.org/officeDocument/2006/bibliography"/>
-  </ds:schemaRefs>
-</ds:datastoreItem>
 </file>
</xml_diff>

<commit_message>
Creation of new static URLs, just about to create dynamic ones
</commit_message>
<xml_diff>
--- a/00.-Introducción a Django.docx
+++ b/00.-Introducción a Django.docx
@@ -253,7 +253,6 @@
                               </w:rPr>
                               <w:t xml:space="preserve">Desarrollo </w:t>
                             </w:r>
-                            <w:proofErr w:type="spellStart"/>
                             <w:r>
                               <w:rPr>
                                 <w:rStyle w:val="Referenciasutil"/>
@@ -265,7 +264,6 @@
                               </w:rPr>
                               <w:t>Backend</w:t>
                             </w:r>
-                            <w:proofErr w:type="spellEnd"/>
                           </w:p>
                           <w:p>
                             <w:pPr>
@@ -559,7 +557,6 @@
                         </w:rPr>
                         <w:t xml:space="preserve">Desarrollo </w:t>
                       </w:r>
-                      <w:proofErr w:type="spellStart"/>
                       <w:r>
                         <w:rPr>
                           <w:rStyle w:val="Referenciasutil"/>
@@ -571,7 +568,6 @@
                         </w:rPr>
                         <w:t>Backend</w:t>
                       </w:r>
-                      <w:proofErr w:type="spellEnd"/>
                     </w:p>
                     <w:p>
                       <w:pPr>
@@ -734,7 +730,7 @@
           <w:r>
             <w:fldChar w:fldCharType="separate"/>
           </w:r>
-          <w:hyperlink w:anchor="_Toc229992082" w:history="1">
+          <w:hyperlink w:anchor="_Toc229992246" w:history="1">
             <w:r>
               <w:rPr>
                 <w:rStyle w:val="Hipervnculo"/>
@@ -762,7 +758,7 @@
                 <w:noProof/>
                 <w:webHidden/>
               </w:rPr>
-              <w:instrText xml:space="preserve"> PAGEREF _Toc229992082 \h </w:instrText>
+              <w:instrText xml:space="preserve"> PAGEREF _Toc229992246 \h </w:instrText>
             </w:r>
             <w:r>
               <w:rPr>
@@ -808,7 +804,7 @@
               <w14:ligatures w14:val="standardContextual"/>
             </w:rPr>
           </w:pPr>
-          <w:hyperlink w:anchor="_Toc229992083" w:history="1">
+          <w:hyperlink w:anchor="_Toc229992247" w:history="1">
             <w:r>
               <w:rPr>
                 <w:rStyle w:val="Hipervnculo"/>
@@ -835,7 +831,7 @@
                 <w:noProof/>
                 <w:webHidden/>
               </w:rPr>
-              <w:instrText xml:space="preserve"> PAGEREF _Toc229992083 \h </w:instrText>
+              <w:instrText xml:space="preserve"> PAGEREF _Toc229992247 \h </w:instrText>
             </w:r>
             <w:r>
               <w:rPr>
@@ -881,7 +877,7 @@
               <w14:ligatures w14:val="standardContextual"/>
             </w:rPr>
           </w:pPr>
-          <w:hyperlink w:anchor="_Toc229992084" w:history="1">
+          <w:hyperlink w:anchor="_Toc229992248" w:history="1">
             <w:r>
               <w:rPr>
                 <w:rStyle w:val="Hipervnculo"/>
@@ -909,7 +905,7 @@
                 <w:noProof/>
                 <w:webHidden/>
               </w:rPr>
-              <w:instrText xml:space="preserve"> PAGEREF _Toc229992084 \h </w:instrText>
+              <w:instrText xml:space="preserve"> PAGEREF _Toc229992248 \h </w:instrText>
             </w:r>
             <w:r>
               <w:rPr>
@@ -955,7 +951,7 @@
               <w14:ligatures w14:val="standardContextual"/>
             </w:rPr>
           </w:pPr>
-          <w:hyperlink w:anchor="_Toc229992085" w:history="1">
+          <w:hyperlink w:anchor="_Toc229992249" w:history="1">
             <w:r>
               <w:rPr>
                 <w:rStyle w:val="Hipervnculo"/>
@@ -982,7 +978,7 @@
                 <w:noProof/>
                 <w:webHidden/>
               </w:rPr>
-              <w:instrText xml:space="preserve"> PAGEREF _Toc229992085 \h </w:instrText>
+              <w:instrText xml:space="preserve"> PAGEREF _Toc229992249 \h </w:instrText>
             </w:r>
             <w:r>
               <w:rPr>
@@ -1028,7 +1024,7 @@
               <w14:ligatures w14:val="standardContextual"/>
             </w:rPr>
           </w:pPr>
-          <w:hyperlink w:anchor="_Toc229992086" w:history="1">
+          <w:hyperlink w:anchor="_Toc229992250" w:history="1">
             <w:r>
               <w:rPr>
                 <w:rStyle w:val="Hipervnculo"/>
@@ -1055,7 +1051,7 @@
                 <w:noProof/>
                 <w:webHidden/>
               </w:rPr>
-              <w:instrText xml:space="preserve"> PAGEREF _Toc229992086 \h </w:instrText>
+              <w:instrText xml:space="preserve"> PAGEREF _Toc229992250 \h </w:instrText>
             </w:r>
             <w:r>
               <w:rPr>
@@ -1101,13 +1097,27 @@
               <w14:ligatures w14:val="standardContextual"/>
             </w:rPr>
           </w:pPr>
-          <w:hyperlink w:anchor="_Toc229992087" w:history="1">
+          <w:hyperlink w:anchor="_Toc229992251" w:history="1">
             <w:r>
               <w:rPr>
                 <w:rStyle w:val="Hipervnculo"/>
                 <w:noProof/>
               </w:rPr>
-              <w:t>URLs.py: Archivo de Configuración de Endpoints</w:t>
+              <w:t>URLs.py: Archivo de Configuraci</w:t>
+            </w:r>
+            <w:r>
+              <w:rPr>
+                <w:rStyle w:val="Hipervnculo"/>
+                <w:noProof/>
+              </w:rPr>
+              <w:t>ó</w:t>
+            </w:r>
+            <w:r>
+              <w:rPr>
+                <w:rStyle w:val="Hipervnculo"/>
+                <w:noProof/>
+              </w:rPr>
+              <w:t>n de Endpoints</w:t>
             </w:r>
             <w:r>
               <w:rPr>
@@ -1128,7 +1138,7 @@
                 <w:noProof/>
                 <w:webHidden/>
               </w:rPr>
-              <w:instrText xml:space="preserve"> PAGEREF _Toc229992087 \h </w:instrText>
+              <w:instrText xml:space="preserve"> PAGEREF _Toc229992251 \h </w:instrText>
             </w:r>
             <w:r>
               <w:rPr>
@@ -1174,7 +1184,7 @@
               <w14:ligatures w14:val="standardContextual"/>
             </w:rPr>
           </w:pPr>
-          <w:hyperlink w:anchor="_Toc229992088" w:history="1">
+          <w:hyperlink w:anchor="_Toc229992252" w:history="1">
             <w:r>
               <w:rPr>
                 <w:rStyle w:val="Hipervnculo"/>
@@ -1201,7 +1211,7 @@
                 <w:noProof/>
                 <w:webHidden/>
               </w:rPr>
-              <w:instrText xml:space="preserve"> PAGEREF _Toc229992088 \h </w:instrText>
+              <w:instrText xml:space="preserve"> PAGEREF _Toc229992252 \h </w:instrText>
             </w:r>
             <w:r>
               <w:rPr>
@@ -1262,7 +1272,7 @@
           <w:lang w:val="es-MX"/>
         </w:rPr>
       </w:pPr>
-      <w:bookmarkStart w:id="0" w:name="_Toc229992082"/>
+      <w:bookmarkStart w:id="0" w:name="_Toc229992246"/>
       <w:r>
         <w:rPr>
           <w:lang w:val="es-MX"/>
@@ -3111,7 +3121,7 @@
       <w:pPr>
         <w:pStyle w:val="Ttulo1"/>
       </w:pPr>
-      <w:bookmarkStart w:id="1" w:name="_Toc229992083"/>
+      <w:bookmarkStart w:id="1" w:name="_Toc229992247"/>
       <w:r>
         <w:t xml:space="preserve">Arquitectura MVT (Model View </w:t>
       </w:r>
@@ -6384,7 +6394,7 @@
           <w:lang w:val="es-MX"/>
         </w:rPr>
       </w:pPr>
-      <w:bookmarkStart w:id="2" w:name="_Toc229992084"/>
+      <w:bookmarkStart w:id="2" w:name="_Toc229992248"/>
       <w:r>
         <w:rPr>
           <w:lang w:val="es-MX"/>
@@ -7523,7 +7533,7 @@
       <w:pPr>
         <w:pStyle w:val="Ttulo3"/>
       </w:pPr>
-      <w:bookmarkStart w:id="3" w:name="_Toc229992085"/>
+      <w:bookmarkStart w:id="3" w:name="_Toc229992249"/>
       <w:r>
         <w:lastRenderedPageBreak/>
         <w:t>Base de Datos SQLite</w:t>
@@ -8150,7 +8160,7 @@
           <w:color w:val="BBBEBF"/>
           <w:sz w:val="21"/>
           <w:szCs w:val="21"/>
-          <w:lang w:eastAsia="es-MX"/>
+          <w:lang w:val="es-MX" w:eastAsia="es-MX"/>
         </w:rPr>
       </w:pPr>
       <w:r>
@@ -8169,69 +8179,11 @@
           <w:color w:val="A5D6FF"/>
           <w:sz w:val="21"/>
           <w:szCs w:val="21"/>
-          <w:lang w:eastAsia="es-MX"/>
+          <w:lang w:val="es-MX" w:eastAsia="es-MX"/>
         </w:rPr>
         <w:t>'ENGINE'</w:t>
       </w:r>
       <w:r>
-        <w:rPr>
-          <w:rFonts w:ascii="Consolas" w:eastAsia="Times New Roman" w:hAnsi="Consolas" w:cs="Times New Roman"/>
-          <w:color w:val="BBBEBF"/>
-          <w:sz w:val="21"/>
-          <w:szCs w:val="21"/>
-          <w:lang w:eastAsia="es-MX"/>
-        </w:rPr>
-        <w:t xml:space="preserve">: </w:t>
-      </w:r>
-      <w:r>
-        <w:rPr>
-          <w:rFonts w:ascii="Consolas" w:eastAsia="Times New Roman" w:hAnsi="Consolas" w:cs="Times New Roman"/>
-          <w:color w:val="A5D6FF"/>
-          <w:sz w:val="21"/>
-          <w:szCs w:val="21"/>
-          <w:lang w:eastAsia="es-MX"/>
-        </w:rPr>
-        <w:t>'django.</w:t>
-      </w:r>
-      <w:proofErr w:type="gramStart"/>
-      <w:r>
-        <w:rPr>
-          <w:rFonts w:ascii="Consolas" w:eastAsia="Times New Roman" w:hAnsi="Consolas" w:cs="Times New Roman"/>
-          <w:color w:val="A5D6FF"/>
-          <w:sz w:val="21"/>
-          <w:szCs w:val="21"/>
-          <w:lang w:eastAsia="es-MX"/>
-        </w:rPr>
-        <w:t>db.backends</w:t>
-      </w:r>
-      <w:proofErr w:type="gramEnd"/>
-      <w:r>
-        <w:rPr>
-          <w:rFonts w:ascii="Consolas" w:eastAsia="Times New Roman" w:hAnsi="Consolas" w:cs="Times New Roman"/>
-          <w:color w:val="A5D6FF"/>
-          <w:sz w:val="21"/>
-          <w:szCs w:val="21"/>
-          <w:lang w:eastAsia="es-MX"/>
-        </w:rPr>
-        <w:t>.sqlite3'</w:t>
-      </w:r>
-      <w:r>
-        <w:rPr>
-          <w:rFonts w:ascii="Consolas" w:eastAsia="Times New Roman" w:hAnsi="Consolas" w:cs="Times New Roman"/>
-          <w:color w:val="BBBEBF"/>
-          <w:sz w:val="21"/>
-          <w:szCs w:val="21"/>
-          <w:lang w:eastAsia="es-MX"/>
-        </w:rPr>
-        <w:t>,</w:t>
-      </w:r>
-    </w:p>
-    <w:p>
-      <w:pPr>
-        <w:shd w:val="clear" w:color="auto" w:fill="121314"/>
-        <w:spacing w:after="0" w:line="285" w:lineRule="atLeast"/>
-        <w:ind w:left="720"/>
-        <w:jc w:val="left"/>
         <w:rPr>
           <w:rFonts w:ascii="Consolas" w:eastAsia="Times New Roman" w:hAnsi="Consolas" w:cs="Times New Roman"/>
           <w:color w:val="BBBEBF"/>
@@ -8239,14 +8191,72 @@
           <w:szCs w:val="21"/>
           <w:lang w:val="es-MX" w:eastAsia="es-MX"/>
         </w:rPr>
-      </w:pPr>
+        <w:t xml:space="preserve">: </w:t>
+      </w:r>
+      <w:r>
+        <w:rPr>
+          <w:rFonts w:ascii="Consolas" w:eastAsia="Times New Roman" w:hAnsi="Consolas" w:cs="Times New Roman"/>
+          <w:color w:val="A5D6FF"/>
+          <w:sz w:val="21"/>
+          <w:szCs w:val="21"/>
+          <w:lang w:val="es-MX" w:eastAsia="es-MX"/>
+        </w:rPr>
+        <w:t>'django.</w:t>
+      </w:r>
+      <w:proofErr w:type="gramStart"/>
+      <w:r>
+        <w:rPr>
+          <w:rFonts w:ascii="Consolas" w:eastAsia="Times New Roman" w:hAnsi="Consolas" w:cs="Times New Roman"/>
+          <w:color w:val="A5D6FF"/>
+          <w:sz w:val="21"/>
+          <w:szCs w:val="21"/>
+          <w:lang w:val="es-MX" w:eastAsia="es-MX"/>
+        </w:rPr>
+        <w:t>db.backends</w:t>
+      </w:r>
+      <w:proofErr w:type="gramEnd"/>
+      <w:r>
+        <w:rPr>
+          <w:rFonts w:ascii="Consolas" w:eastAsia="Times New Roman" w:hAnsi="Consolas" w:cs="Times New Roman"/>
+          <w:color w:val="A5D6FF"/>
+          <w:sz w:val="21"/>
+          <w:szCs w:val="21"/>
+          <w:lang w:val="es-MX" w:eastAsia="es-MX"/>
+        </w:rPr>
+        <w:t>.sqlite3'</w:t>
+      </w:r>
       <w:r>
         <w:rPr>
           <w:rFonts w:ascii="Consolas" w:eastAsia="Times New Roman" w:hAnsi="Consolas" w:cs="Times New Roman"/>
           <w:color w:val="BBBEBF"/>
           <w:sz w:val="21"/>
           <w:szCs w:val="21"/>
-          <w:lang w:eastAsia="es-MX"/>
+          <w:lang w:val="es-MX" w:eastAsia="es-MX"/>
+        </w:rPr>
+        <w:t>,</w:t>
+      </w:r>
+    </w:p>
+    <w:p>
+      <w:pPr>
+        <w:shd w:val="clear" w:color="auto" w:fill="121314"/>
+        <w:spacing w:after="0" w:line="285" w:lineRule="atLeast"/>
+        <w:ind w:left="720"/>
+        <w:jc w:val="left"/>
+        <w:rPr>
+          <w:rFonts w:ascii="Consolas" w:eastAsia="Times New Roman" w:hAnsi="Consolas" w:cs="Times New Roman"/>
+          <w:color w:val="BBBEBF"/>
+          <w:sz w:val="21"/>
+          <w:szCs w:val="21"/>
+          <w:lang w:val="es-MX" w:eastAsia="es-MX"/>
+        </w:rPr>
+      </w:pPr>
+      <w:r>
+        <w:rPr>
+          <w:rFonts w:ascii="Consolas" w:eastAsia="Times New Roman" w:hAnsi="Consolas" w:cs="Times New Roman"/>
+          <w:color w:val="BBBEBF"/>
+          <w:sz w:val="21"/>
+          <w:szCs w:val="21"/>
+          <w:lang w:val="es-MX" w:eastAsia="es-MX"/>
         </w:rPr>
         <w:t xml:space="preserve">        </w:t>
       </w:r>
@@ -9684,7 +9694,7 @@
       <w:pPr>
         <w:pStyle w:val="Ttulo3"/>
       </w:pPr>
-      <w:bookmarkStart w:id="4" w:name="_Toc229992086"/>
+      <w:bookmarkStart w:id="4" w:name="_Toc229992250"/>
       <w:r>
         <w:t>Tipos de Relaciones entre Tablas: Uno a Muchos, Muchos a Muchos y Uno a Uno</w:t>
       </w:r>
@@ -9957,13 +9967,7 @@
         <w:rPr>
           <w:lang w:val="es-MX"/>
         </w:rPr>
-        <w:t xml:space="preserve"> </w:t>
-      </w:r>
-      <w:r>
-        <w:rPr>
-          <w:lang w:val="es-MX"/>
-        </w:rPr>
-        <w:t>Es una relación donde un registro</w:t>
+        <w:t xml:space="preserve"> Es una relación donde un registro</w:t>
       </w:r>
       <w:r>
         <w:rPr>
@@ -10021,15 +10025,7 @@
           <w:bCs/>
           <w:lang w:val="es-MX"/>
         </w:rPr>
-        <w:t>Un A tiene un solo B</w:t>
-      </w:r>
-      <w:r>
-        <w:rPr>
-          <w:b/>
-          <w:bCs/>
-          <w:lang w:val="es-MX"/>
-        </w:rPr>
-        <w:t xml:space="preserve"> </w:t>
+        <w:t xml:space="preserve">Un A tiene un solo B </w:t>
       </w:r>
       <w:r>
         <w:rPr>
@@ -10336,7 +10332,7 @@
       <w:pPr>
         <w:pStyle w:val="Ttulo3"/>
       </w:pPr>
-      <w:bookmarkStart w:id="5" w:name="_Toc229992087"/>
+      <w:bookmarkStart w:id="5" w:name="_Toc229992251"/>
       <w:r>
         <w:t xml:space="preserve">URLs.py: Archivo de Configuración de </w:t>
       </w:r>
@@ -10554,15 +10550,40 @@
         <w:rPr>
           <w:lang w:val="es-ES"/>
         </w:rPr>
-        <w:t xml:space="preserve"> centralizados, para ello se creará un nuevo archivo desde cero en el directorio de </w:t>
-      </w:r>
-      <w:r>
-        <w:rPr>
-          <w:b/>
-          <w:bCs/>
-          <w:lang w:val="es-ES"/>
-        </w:rPr>
-        <w:t>a_first_proyect/a_</w:t>
+        <w:t xml:space="preserve"> centralizados, para ello se creará un nuevo archivo desde cero en el directorio de</w:t>
+      </w:r>
+      <w:r>
+        <w:rPr>
+          <w:lang w:val="es-ES"/>
+        </w:rPr>
+        <w:t xml:space="preserve"> </w:t>
+      </w:r>
+      <w:proofErr w:type="spellStart"/>
+      <w:r>
+        <w:rPr>
+          <w:b/>
+          <w:bCs/>
+          <w:lang w:val="es-ES"/>
+        </w:rPr>
+        <w:t>a_first_proyect</w:t>
+      </w:r>
+      <w:proofErr w:type="spellEnd"/>
+      <w:r>
+        <w:rPr>
+          <w:b/>
+          <w:bCs/>
+          <w:lang w:val="es-ES"/>
+        </w:rPr>
+        <w:t>/</w:t>
+      </w:r>
+      <w:proofErr w:type="spellStart"/>
+      <w:r>
+        <w:rPr>
+          <w:b/>
+          <w:bCs/>
+          <w:lang w:val="es-ES"/>
+        </w:rPr>
+        <w:t>a_</w:t>
       </w:r>
       <w:r>
         <w:rPr>
@@ -10572,6 +10593,7 @@
         </w:rPr>
         <w:t>app_name</w:t>
       </w:r>
+      <w:proofErr w:type="spellEnd"/>
       <w:r>
         <w:rPr>
           <w:b/>
@@ -10587,7 +10609,7 @@
           <w:color w:val="00B0F0"/>
           <w:lang w:val="es-ES"/>
         </w:rPr>
-        <w:t>url</w:t>
+        <w:t>urls</w:t>
       </w:r>
       <w:r>
         <w:rPr>
@@ -10596,38 +10618,1209 @@
           <w:color w:val="00B0F0"/>
           <w:lang w:val="es-ES"/>
         </w:rPr>
-        <w:t>s</w:t>
-      </w:r>
-      <w:r>
-        <w:rPr>
-          <w:b/>
-          <w:bCs/>
-          <w:color w:val="00B0F0"/>
-          <w:lang w:val="es-ES"/>
-        </w:rPr>
         <w:t>.py</w:t>
+      </w:r>
+      <w:r>
+        <w:rPr>
+          <w:lang w:val="es-ES"/>
+        </w:rPr>
+        <w:t xml:space="preserve">, </w:t>
+      </w:r>
+      <w:r>
+        <w:rPr>
+          <w:lang w:val="es-ES"/>
+        </w:rPr>
+        <w:t xml:space="preserve">teniendo solo el </w:t>
+      </w:r>
+      <w:proofErr w:type="spellStart"/>
+      <w:r>
+        <w:rPr>
+          <w:lang w:val="es-ES"/>
+        </w:rPr>
+        <w:t>import</w:t>
+      </w:r>
+      <w:proofErr w:type="spellEnd"/>
+      <w:r>
+        <w:rPr>
+          <w:lang w:val="es-ES"/>
+        </w:rPr>
+        <w:t xml:space="preserve"> de </w:t>
+      </w:r>
+      <w:proofErr w:type="spellStart"/>
+      <w:r>
+        <w:rPr>
+          <w:lang w:val="es-ES"/>
+        </w:rPr>
+        <w:t>path</w:t>
+      </w:r>
+      <w:proofErr w:type="spellEnd"/>
+      <w:r>
+        <w:rPr>
+          <w:lang w:val="es-ES"/>
+        </w:rPr>
+        <w:t xml:space="preserve">, proveniente de </w:t>
+      </w:r>
+      <w:proofErr w:type="spellStart"/>
+      <w:r>
+        <w:rPr>
+          <w:lang w:val="es-ES"/>
+        </w:rPr>
+        <w:t>django.urls</w:t>
+      </w:r>
+      <w:proofErr w:type="spellEnd"/>
+      <w:r>
+        <w:rPr>
+          <w:lang w:val="es-ES"/>
+        </w:rPr>
+        <w:t xml:space="preserve"> y la lista </w:t>
+      </w:r>
+      <w:proofErr w:type="spellStart"/>
+      <w:r>
+        <w:rPr>
+          <w:lang w:val="es-ES"/>
+        </w:rPr>
+        <w:t>urlpatterns</w:t>
+      </w:r>
+      <w:proofErr w:type="spellEnd"/>
+      <w:r>
+        <w:rPr>
+          <w:lang w:val="es-ES"/>
+        </w:rPr>
+        <w:t xml:space="preserve"> vacía.</w:t>
       </w:r>
     </w:p>
     <w:p>
       <w:pPr>
-        <w:rPr>
-          <w:lang w:val="es-ES"/>
-        </w:rPr>
-      </w:pPr>
+        <w:jc w:val="center"/>
+        <w:rPr>
+          <w:lang w:val="es-ES"/>
+        </w:rPr>
+      </w:pPr>
+      <w:r>
+        <w:rPr>
+          <w:lang w:val="es-ES"/>
+        </w:rPr>
+        <w:drawing>
+          <wp:inline distT="0" distB="0" distL="0" distR="0" wp14:anchorId="0C4596A3" wp14:editId="65544451">
+            <wp:extent cx="5943600" cy="1889760"/>
+            <wp:effectExtent l="0" t="0" r="0" b="0"/>
+            <wp:docPr id="844632250" name="Imagen 1"/>
+            <wp:cNvGraphicFramePr>
+              <a:graphicFrameLocks xmlns:a="http://schemas.openxmlformats.org/drawingml/2006/main" noChangeAspect="1"/>
+            </wp:cNvGraphicFramePr>
+            <a:graphic xmlns:a="http://schemas.openxmlformats.org/drawingml/2006/main">
+              <a:graphicData uri="http://schemas.openxmlformats.org/drawingml/2006/picture">
+                <pic:pic xmlns:pic="http://schemas.openxmlformats.org/drawingml/2006/picture">
+                  <pic:nvPicPr>
+                    <pic:cNvPr id="844632250" name=""/>
+                    <pic:cNvPicPr/>
+                  </pic:nvPicPr>
+                  <pic:blipFill>
+                    <a:blip r:embed="rId32"/>
+                    <a:stretch>
+                      <a:fillRect/>
+                    </a:stretch>
+                  </pic:blipFill>
+                  <pic:spPr>
+                    <a:xfrm>
+                      <a:off x="0" y="0"/>
+                      <a:ext cx="5943600" cy="1889760"/>
+                    </a:xfrm>
+                    <a:prstGeom prst="rect">
+                      <a:avLst/>
+                    </a:prstGeom>
+                  </pic:spPr>
+                </pic:pic>
+              </a:graphicData>
+            </a:graphic>
+          </wp:inline>
+        </w:drawing>
+      </w:r>
     </w:p>
     <w:p>
       <w:pPr>
         <w:rPr>
-          <w:lang w:val="es-MX"/>
-        </w:rPr>
-      </w:pPr>
+          <w:lang w:val="es-ES"/>
+        </w:rPr>
+      </w:pPr>
+      <w:r>
+        <w:rPr>
+          <w:lang w:val="es-ES"/>
+        </w:rPr>
+        <w:t xml:space="preserve">Después, para que podamos incluir el archivo de </w:t>
+      </w:r>
+      <w:proofErr w:type="spellStart"/>
+      <w:r>
+        <w:rPr>
+          <w:lang w:val="es-ES"/>
+        </w:rPr>
+        <w:t>URLs</w:t>
+      </w:r>
+      <w:proofErr w:type="spellEnd"/>
+      <w:r>
+        <w:rPr>
+          <w:lang w:val="es-ES"/>
+        </w:rPr>
+        <w:t xml:space="preserve"> de nuestra aplicación </w:t>
+      </w:r>
+      <w:proofErr w:type="spellStart"/>
+      <w:r>
+        <w:rPr>
+          <w:b/>
+          <w:bCs/>
+          <w:lang w:val="es-ES"/>
+        </w:rPr>
+        <w:t>a_first_proyect</w:t>
+      </w:r>
+      <w:proofErr w:type="spellEnd"/>
+      <w:r>
+        <w:rPr>
+          <w:b/>
+          <w:bCs/>
+          <w:lang w:val="es-ES"/>
+        </w:rPr>
+        <w:t>/</w:t>
+      </w:r>
+      <w:proofErr w:type="spellStart"/>
+      <w:r>
+        <w:rPr>
+          <w:b/>
+          <w:bCs/>
+          <w:lang w:val="es-ES"/>
+        </w:rPr>
+        <w:t>a_</w:t>
+      </w:r>
+      <w:r>
+        <w:rPr>
+          <w:b/>
+          <w:bCs/>
+          <w:lang w:val="es-ES"/>
+        </w:rPr>
+        <w:t>app_name</w:t>
+      </w:r>
+      <w:proofErr w:type="spellEnd"/>
+      <w:r>
+        <w:rPr>
+          <w:b/>
+          <w:bCs/>
+          <w:lang w:val="es-ES"/>
+        </w:rPr>
+        <w:t>/</w:t>
+      </w:r>
+      <w:r>
+        <w:rPr>
+          <w:b/>
+          <w:bCs/>
+          <w:color w:val="00B0F0"/>
+          <w:lang w:val="es-ES"/>
+        </w:rPr>
+        <w:t>urls</w:t>
+      </w:r>
+      <w:r>
+        <w:rPr>
+          <w:b/>
+          <w:bCs/>
+          <w:color w:val="00B0F0"/>
+          <w:lang w:val="es-ES"/>
+        </w:rPr>
+        <w:t>.py</w:t>
+      </w:r>
+      <w:r>
+        <w:rPr>
+          <w:lang w:val="es-ES"/>
+        </w:rPr>
+        <w:t xml:space="preserve">, en el </w:t>
+      </w:r>
+      <w:r>
+        <w:rPr>
+          <w:lang w:val="es-ES"/>
+        </w:rPr>
+        <w:t xml:space="preserve">script </w:t>
+      </w:r>
+      <w:r>
+        <w:rPr>
+          <w:lang w:val="es-ES"/>
+        </w:rPr>
+        <w:t xml:space="preserve">de </w:t>
+      </w:r>
+      <w:proofErr w:type="spellStart"/>
+      <w:r>
+        <w:rPr>
+          <w:lang w:val="es-ES"/>
+        </w:rPr>
+        <w:t>URLs</w:t>
+      </w:r>
+      <w:proofErr w:type="spellEnd"/>
+      <w:r>
+        <w:rPr>
+          <w:lang w:val="es-ES"/>
+        </w:rPr>
+        <w:t xml:space="preserve"> de nuestro proyecto </w:t>
+      </w:r>
+      <w:proofErr w:type="spellStart"/>
+      <w:r>
+        <w:rPr>
+          <w:b/>
+          <w:bCs/>
+          <w:lang w:val="es-ES"/>
+        </w:rPr>
+        <w:t>a_first_proyect</w:t>
+      </w:r>
+      <w:proofErr w:type="spellEnd"/>
+      <w:r>
+        <w:rPr>
+          <w:b/>
+          <w:bCs/>
+          <w:lang w:val="es-ES"/>
+        </w:rPr>
+        <w:t>/</w:t>
+      </w:r>
+      <w:proofErr w:type="spellStart"/>
+      <w:r>
+        <w:rPr>
+          <w:b/>
+          <w:bCs/>
+          <w:lang w:val="es-ES"/>
+        </w:rPr>
+        <w:t>a_first_proyect</w:t>
+      </w:r>
+      <w:proofErr w:type="spellEnd"/>
+      <w:r>
+        <w:rPr>
+          <w:b/>
+          <w:bCs/>
+          <w:lang w:val="es-ES"/>
+        </w:rPr>
+        <w:t>/</w:t>
+      </w:r>
+      <w:r>
+        <w:rPr>
+          <w:b/>
+          <w:bCs/>
+          <w:color w:val="00B0F0"/>
+          <w:lang w:val="es-ES"/>
+        </w:rPr>
+        <w:t>urls.py</w:t>
+      </w:r>
+      <w:r>
+        <w:rPr>
+          <w:lang w:val="es-ES"/>
+        </w:rPr>
+        <w:t xml:space="preserve">, lo que debemos hacer es </w:t>
+      </w:r>
+      <w:r>
+        <w:rPr>
+          <w:lang w:val="es-ES"/>
+        </w:rPr>
+        <w:t xml:space="preserve">importar la función </w:t>
+      </w:r>
+      <w:proofErr w:type="spellStart"/>
+      <w:r>
+        <w:rPr>
+          <w:lang w:val="es-ES"/>
+        </w:rPr>
+        <w:t>include</w:t>
+      </w:r>
+      <w:proofErr w:type="spellEnd"/>
+      <w:r>
+        <w:rPr>
+          <w:lang w:val="es-ES"/>
+        </w:rPr>
+        <w:t xml:space="preserve">() de la librería </w:t>
+      </w:r>
+      <w:proofErr w:type="spellStart"/>
+      <w:r>
+        <w:rPr>
+          <w:lang w:val="es-ES"/>
+        </w:rPr>
+        <w:t>django.urls</w:t>
+      </w:r>
+      <w:proofErr w:type="spellEnd"/>
+      <w:r>
+        <w:rPr>
+          <w:lang w:val="es-ES"/>
+        </w:rPr>
+        <w:t xml:space="preserve"> y añadir el </w:t>
+      </w:r>
+      <w:proofErr w:type="spellStart"/>
+      <w:r>
+        <w:rPr>
+          <w:lang w:val="es-ES"/>
+        </w:rPr>
+        <w:t>path</w:t>
+      </w:r>
+      <w:proofErr w:type="spellEnd"/>
+      <w:r>
+        <w:rPr>
+          <w:lang w:val="es-ES"/>
+        </w:rPr>
+        <w:t xml:space="preserve"> del archivo </w:t>
+      </w:r>
+      <w:r>
+        <w:rPr>
+          <w:b/>
+          <w:bCs/>
+          <w:color w:val="00B0F0"/>
+          <w:lang w:val="es-ES"/>
+        </w:rPr>
+        <w:t>urls.py</w:t>
+      </w:r>
+      <w:r>
+        <w:rPr>
+          <w:lang w:val="es-ES"/>
+        </w:rPr>
+        <w:t xml:space="preserve"> de la carpeta </w:t>
+      </w:r>
+      <w:proofErr w:type="spellStart"/>
+      <w:r>
+        <w:rPr>
+          <w:b/>
+          <w:bCs/>
+          <w:lang w:val="es-ES"/>
+        </w:rPr>
+        <w:t>a_</w:t>
+      </w:r>
+      <w:r>
+        <w:rPr>
+          <w:b/>
+          <w:bCs/>
+          <w:lang w:val="es-ES"/>
+        </w:rPr>
+        <w:t>app_name</w:t>
+      </w:r>
+      <w:proofErr w:type="spellEnd"/>
+      <w:r>
+        <w:rPr>
+          <w:lang w:val="es-ES"/>
+        </w:rPr>
+        <w:t xml:space="preserve">, </w:t>
+      </w:r>
+      <w:r>
+        <w:rPr>
+          <w:lang w:val="es-ES"/>
+        </w:rPr>
+        <w:t xml:space="preserve">con la sintaxis de módulo de Python, esta dicta que cada carpeta que tenga dentro de ella un archivo </w:t>
+      </w:r>
+      <w:r>
+        <w:rPr>
+          <w:b/>
+          <w:bCs/>
+          <w:color w:val="00B0F0"/>
+          <w:lang w:val="es-ES"/>
+        </w:rPr>
+        <w:t>__init__.py</w:t>
+      </w:r>
+      <w:r>
+        <w:rPr>
+          <w:color w:val="00B0F0"/>
+          <w:lang w:val="es-ES"/>
+        </w:rPr>
+        <w:t xml:space="preserve"> </w:t>
+      </w:r>
+      <w:r>
+        <w:rPr>
+          <w:lang w:val="es-ES"/>
+        </w:rPr>
+        <w:t xml:space="preserve">se considera como un módulo y todos los scripts que contenga se considerarán como extensiones del módulo, teniendo la sintaxis de </w:t>
+      </w:r>
+      <w:r>
+        <w:rPr>
+          <w:b/>
+          <w:bCs/>
+          <w:color w:val="00B050"/>
+          <w:lang w:val="es-ES"/>
+        </w:rPr>
+        <w:t>'</w:t>
+      </w:r>
+      <w:proofErr w:type="spellStart"/>
+      <w:r>
+        <w:rPr>
+          <w:b/>
+          <w:bCs/>
+          <w:color w:val="00B050"/>
+          <w:lang w:val="es-ES"/>
+        </w:rPr>
+        <w:t>módulo.extensión</w:t>
+      </w:r>
+      <w:proofErr w:type="spellEnd"/>
+      <w:r>
+        <w:rPr>
+          <w:b/>
+          <w:bCs/>
+          <w:color w:val="00B050"/>
+          <w:lang w:val="es-ES"/>
+        </w:rPr>
+        <w:t>'</w:t>
+      </w:r>
+      <w:r>
+        <w:rPr>
+          <w:lang w:val="es-ES"/>
+        </w:rPr>
+        <w:t xml:space="preserve"> y </w:t>
+      </w:r>
+      <w:r>
+        <w:rPr>
+          <w:lang w:val="es-ES"/>
+        </w:rPr>
+        <w:t xml:space="preserve">entonces como la carpeta de nuestra app cuenta con un archivo </w:t>
+      </w:r>
+      <w:proofErr w:type="spellStart"/>
+      <w:r>
+        <w:rPr>
+          <w:lang w:val="es-ES"/>
+        </w:rPr>
+        <w:t>init</w:t>
+      </w:r>
+      <w:proofErr w:type="spellEnd"/>
+      <w:r>
+        <w:rPr>
+          <w:lang w:val="es-ES"/>
+        </w:rPr>
+        <w:t xml:space="preserve"> y además tiene contenido el script </w:t>
+      </w:r>
+      <w:r>
+        <w:rPr>
+          <w:b/>
+          <w:bCs/>
+          <w:color w:val="00B0F0"/>
+          <w:lang w:val="es-ES"/>
+        </w:rPr>
+        <w:t>urls.py</w:t>
+      </w:r>
+      <w:r>
+        <w:rPr>
+          <w:lang w:val="es-ES"/>
+        </w:rPr>
+        <w:t xml:space="preserve">, la sintaxis de módulo para importar ese archivo a través de la función </w:t>
+      </w:r>
+      <w:proofErr w:type="spellStart"/>
+      <w:r>
+        <w:rPr>
+          <w:lang w:val="es-ES"/>
+        </w:rPr>
+        <w:t>include</w:t>
+      </w:r>
+      <w:proofErr w:type="spellEnd"/>
+      <w:r>
+        <w:rPr>
+          <w:lang w:val="es-ES"/>
+        </w:rPr>
+        <w:t xml:space="preserve"> </w:t>
+      </w:r>
+      <w:r>
+        <w:rPr>
+          <w:lang w:val="es-ES"/>
+        </w:rPr>
+        <w:t>es</w:t>
+      </w:r>
+      <w:r>
+        <w:rPr>
+          <w:lang w:val="es-ES"/>
+        </w:rPr>
+        <w:t>:</w:t>
+      </w:r>
+      <w:r>
+        <w:rPr>
+          <w:lang w:val="es-ES"/>
+        </w:rPr>
+        <w:t xml:space="preserve"> </w:t>
+      </w:r>
+      <w:proofErr w:type="spellStart"/>
+      <w:r>
+        <w:rPr>
+          <w:b/>
+          <w:bCs/>
+          <w:lang w:val="es-ES"/>
+        </w:rPr>
+        <w:t>include</w:t>
+      </w:r>
+      <w:proofErr w:type="spellEnd"/>
+      <w:r>
+        <w:rPr>
+          <w:b/>
+          <w:bCs/>
+          <w:lang w:val="es-ES"/>
+        </w:rPr>
+        <w:t>(</w:t>
+      </w:r>
+      <w:r>
+        <w:rPr>
+          <w:b/>
+          <w:bCs/>
+          <w:color w:val="00B050"/>
+          <w:lang w:val="es-ES"/>
+        </w:rPr>
+        <w:t>'</w:t>
+      </w:r>
+      <w:proofErr w:type="spellStart"/>
+      <w:r>
+        <w:rPr>
+          <w:b/>
+          <w:bCs/>
+          <w:color w:val="00B050"/>
+          <w:lang w:val="es-ES"/>
+        </w:rPr>
+        <w:t>a_app_name</w:t>
+      </w:r>
+      <w:r>
+        <w:rPr>
+          <w:b/>
+          <w:bCs/>
+          <w:color w:val="00B050"/>
+          <w:lang w:val="es-ES"/>
+        </w:rPr>
+        <w:t>.</w:t>
+      </w:r>
+      <w:r>
+        <w:rPr>
+          <w:b/>
+          <w:bCs/>
+          <w:color w:val="00B050"/>
+          <w:lang w:val="es-ES"/>
+        </w:rPr>
+        <w:t>urls</w:t>
+      </w:r>
+      <w:proofErr w:type="spellEnd"/>
+      <w:r>
+        <w:rPr>
+          <w:b/>
+          <w:bCs/>
+          <w:color w:val="00B050"/>
+          <w:lang w:val="es-ES"/>
+        </w:rPr>
+        <w:t>'</w:t>
+      </w:r>
+      <w:r>
+        <w:rPr>
+          <w:b/>
+          <w:bCs/>
+          <w:lang w:val="es-ES"/>
+        </w:rPr>
+        <w:t>)</w:t>
+      </w:r>
+      <w:r>
+        <w:rPr>
+          <w:b/>
+          <w:bCs/>
+          <w:lang w:val="es-ES"/>
+        </w:rPr>
+        <w:t xml:space="preserve"> </w:t>
+      </w:r>
+      <w:r>
+        <w:rPr>
+          <w:lang w:val="es-ES"/>
+        </w:rPr>
+        <w:t xml:space="preserve">y así es como se importan las </w:t>
+      </w:r>
+      <w:proofErr w:type="spellStart"/>
+      <w:r>
+        <w:rPr>
+          <w:lang w:val="es-ES"/>
+        </w:rPr>
+        <w:t>URLs</w:t>
+      </w:r>
+      <w:proofErr w:type="spellEnd"/>
+      <w:r>
+        <w:rPr>
+          <w:lang w:val="es-ES"/>
+        </w:rPr>
+        <w:t xml:space="preserve"> de la aplicación dentro del archivo de </w:t>
+      </w:r>
+      <w:proofErr w:type="spellStart"/>
+      <w:r>
+        <w:rPr>
+          <w:lang w:val="es-ES"/>
+        </w:rPr>
+        <w:t>URLs</w:t>
+      </w:r>
+      <w:proofErr w:type="spellEnd"/>
+      <w:r>
+        <w:rPr>
+          <w:lang w:val="es-ES"/>
+        </w:rPr>
+        <w:t xml:space="preserve"> global del proyecto.</w:t>
+      </w:r>
     </w:p>
     <w:p>
       <w:pPr>
+        <w:rPr>
+          <w:lang w:val="es-ES"/>
+        </w:rPr>
+      </w:pPr>
+      <w:r>
+        <w:rPr>
+          <w:lang w:val="es-ES"/>
+        </w:rPr>
+        <w:t xml:space="preserve">Nuestra lista de </w:t>
+      </w:r>
+      <w:proofErr w:type="spellStart"/>
+      <w:r>
+        <w:rPr>
+          <w:lang w:val="es-ES"/>
+        </w:rPr>
+        <w:t>endpoints</w:t>
+      </w:r>
+      <w:proofErr w:type="spellEnd"/>
+      <w:r>
+        <w:rPr>
+          <w:lang w:val="es-ES"/>
+        </w:rPr>
+        <w:t xml:space="preserve"> disponibles aparecerá al ejecutar el comando </w:t>
+      </w:r>
+      <w:proofErr w:type="spellStart"/>
+      <w:r>
+        <w:rPr>
+          <w:b/>
+          <w:bCs/>
+          <w:lang w:val="es-MX"/>
+        </w:rPr>
+        <w:t>python</w:t>
+      </w:r>
+      <w:proofErr w:type="spellEnd"/>
+      <w:r>
+        <w:rPr>
+          <w:lang w:val="es-MX"/>
+        </w:rPr>
+        <w:t xml:space="preserve"> </w:t>
+      </w:r>
+      <w:r>
+        <w:rPr>
+          <w:b/>
+          <w:bCs/>
+          <w:color w:val="00B0F0"/>
+          <w:lang w:val="es-MX"/>
+        </w:rPr>
+        <w:t xml:space="preserve">manage.py </w:t>
+      </w:r>
+      <w:proofErr w:type="spellStart"/>
+      <w:r>
+        <w:rPr>
+          <w:b/>
+          <w:bCs/>
+          <w:color w:val="EE0000"/>
+          <w:lang w:val="es-MX"/>
+        </w:rPr>
+        <w:t>runserver</w:t>
+      </w:r>
+      <w:proofErr w:type="spellEnd"/>
+      <w:r>
+        <w:rPr>
+          <w:lang w:val="es-ES"/>
+        </w:rPr>
+        <w:t>,</w:t>
+      </w:r>
+      <w:r>
+        <w:rPr>
+          <w:lang w:val="es-ES"/>
+        </w:rPr>
+        <w:t xml:space="preserve"> donde en un inicio no aparece nada debido a que </w:t>
+      </w:r>
+      <w:r>
+        <w:rPr>
+          <w:lang w:val="es-ES"/>
+        </w:rPr>
+        <w:t xml:space="preserve">no tenemos ningún </w:t>
+      </w:r>
+      <w:proofErr w:type="spellStart"/>
+      <w:r>
+        <w:rPr>
+          <w:lang w:val="es-ES"/>
+        </w:rPr>
+        <w:t>template</w:t>
+      </w:r>
+      <w:proofErr w:type="spellEnd"/>
+      <w:r>
+        <w:rPr>
+          <w:lang w:val="es-ES"/>
+        </w:rPr>
+        <w:t xml:space="preserve"> asociado al </w:t>
+      </w:r>
+      <w:proofErr w:type="spellStart"/>
+      <w:r>
+        <w:rPr>
+          <w:lang w:val="es-ES"/>
+        </w:rPr>
+        <w:t>endpoint</w:t>
+      </w:r>
+      <w:proofErr w:type="spellEnd"/>
+      <w:r>
+        <w:rPr>
+          <w:lang w:val="es-ES"/>
+        </w:rPr>
+        <w:t xml:space="preserve"> </w:t>
+      </w:r>
+      <w:proofErr w:type="spellStart"/>
+      <w:r>
+        <w:rPr>
+          <w:lang w:val="es-ES"/>
+        </w:rPr>
+        <w:t>root</w:t>
+      </w:r>
+      <w:proofErr w:type="spellEnd"/>
+      <w:r>
+        <w:rPr>
+          <w:lang w:val="es-ES"/>
+        </w:rPr>
+        <w:t xml:space="preserve"> (/), pero </w:t>
+      </w:r>
+      <w:r>
+        <w:rPr>
+          <w:lang w:val="es-ES"/>
+        </w:rPr>
+        <w:t xml:space="preserve">si aparece una lista de todas las </w:t>
+      </w:r>
+      <w:proofErr w:type="spellStart"/>
+      <w:r>
+        <w:rPr>
+          <w:lang w:val="es-ES"/>
+        </w:rPr>
+        <w:t>endpoints</w:t>
+      </w:r>
+      <w:proofErr w:type="spellEnd"/>
+      <w:r>
+        <w:rPr>
+          <w:lang w:val="es-ES"/>
+        </w:rPr>
+        <w:t xml:space="preserve"> disponibles y podemos ver que se ha añadido la de la aplicación.</w:t>
+      </w:r>
+    </w:p>
+    <w:p>
+      <w:pPr>
+        <w:jc w:val="center"/>
+        <w:rPr>
+          <w:lang w:val="es-ES"/>
+        </w:rPr>
+      </w:pPr>
+      <w:r>
+        <w:rPr>
+          <w:lang w:val="es-ES"/>
+        </w:rPr>
+        <w:drawing>
+          <wp:inline distT="0" distB="0" distL="0" distR="0" wp14:anchorId="7F8C3AE5" wp14:editId="2C1EBCEB">
+            <wp:extent cx="5943600" cy="2764155"/>
+            <wp:effectExtent l="0" t="0" r="0" b="0"/>
+            <wp:docPr id="950039228" name="Imagen 1"/>
+            <wp:cNvGraphicFramePr>
+              <a:graphicFrameLocks xmlns:a="http://schemas.openxmlformats.org/drawingml/2006/main" noChangeAspect="1"/>
+            </wp:cNvGraphicFramePr>
+            <a:graphic xmlns:a="http://schemas.openxmlformats.org/drawingml/2006/main">
+              <a:graphicData uri="http://schemas.openxmlformats.org/drawingml/2006/picture">
+                <pic:pic xmlns:pic="http://schemas.openxmlformats.org/drawingml/2006/picture">
+                  <pic:nvPicPr>
+                    <pic:cNvPr id="950039228" name=""/>
+                    <pic:cNvPicPr/>
+                  </pic:nvPicPr>
+                  <pic:blipFill>
+                    <a:blip r:embed="rId33"/>
+                    <a:stretch>
+                      <a:fillRect/>
+                    </a:stretch>
+                  </pic:blipFill>
+                  <pic:spPr>
+                    <a:xfrm>
+                      <a:off x="0" y="0"/>
+                      <a:ext cx="5943600" cy="2764155"/>
+                    </a:xfrm>
+                    <a:prstGeom prst="rect">
+                      <a:avLst/>
+                    </a:prstGeom>
+                  </pic:spPr>
+                </pic:pic>
+              </a:graphicData>
+            </a:graphic>
+          </wp:inline>
+        </w:drawing>
+      </w:r>
+    </w:p>
+    <w:p>
+      <w:pPr>
+        <w:jc w:val="center"/>
+        <w:rPr>
+          <w:lang w:val="es-ES"/>
+        </w:rPr>
+      </w:pPr>
+      <w:r>
+        <w:rPr>
+          <w:lang w:val="es-ES"/>
+        </w:rPr>
+        <w:lastRenderedPageBreak/>
+        <w:drawing>
+          <wp:inline distT="0" distB="0" distL="0" distR="0" wp14:anchorId="6A6751AB" wp14:editId="05EA4F46">
+            <wp:extent cx="5943600" cy="1428750"/>
+            <wp:effectExtent l="0" t="0" r="0" b="0"/>
+            <wp:docPr id="628474570" name="Imagen 1"/>
+            <wp:cNvGraphicFramePr>
+              <a:graphicFrameLocks xmlns:a="http://schemas.openxmlformats.org/drawingml/2006/main" noChangeAspect="1"/>
+            </wp:cNvGraphicFramePr>
+            <a:graphic xmlns:a="http://schemas.openxmlformats.org/drawingml/2006/main">
+              <a:graphicData uri="http://schemas.openxmlformats.org/drawingml/2006/picture">
+                <pic:pic xmlns:pic="http://schemas.openxmlformats.org/drawingml/2006/picture">
+                  <pic:nvPicPr>
+                    <pic:cNvPr id="628474570" name=""/>
+                    <pic:cNvPicPr/>
+                  </pic:nvPicPr>
+                  <pic:blipFill>
+                    <a:blip r:embed="rId34"/>
+                    <a:stretch>
+                      <a:fillRect/>
+                    </a:stretch>
+                  </pic:blipFill>
+                  <pic:spPr>
+                    <a:xfrm>
+                      <a:off x="0" y="0"/>
+                      <a:ext cx="5943600" cy="1428750"/>
+                    </a:xfrm>
+                    <a:prstGeom prst="rect">
+                      <a:avLst/>
+                    </a:prstGeom>
+                  </pic:spPr>
+                </pic:pic>
+              </a:graphicData>
+            </a:graphic>
+          </wp:inline>
+        </w:drawing>
+      </w:r>
+    </w:p>
+    <w:p>
+      <w:pPr>
+        <w:rPr>
+          <w:lang w:val="es-MX"/>
+        </w:rPr>
+      </w:pPr>
+      <w:r>
+        <w:rPr>
+          <w:lang w:val="es-ES"/>
+        </w:rPr>
+        <w:t xml:space="preserve">Los </w:t>
+      </w:r>
+      <w:proofErr w:type="spellStart"/>
+      <w:r>
+        <w:rPr>
+          <w:lang w:val="es-ES"/>
+        </w:rPr>
+        <w:t>paths</w:t>
+      </w:r>
+      <w:proofErr w:type="spellEnd"/>
+      <w:r>
+        <w:rPr>
+          <w:lang w:val="es-ES"/>
+        </w:rPr>
+        <w:t xml:space="preserve"> que </w:t>
+      </w:r>
+      <w:r>
+        <w:rPr>
+          <w:lang w:val="es-ES"/>
+        </w:rPr>
+        <w:t>se declare</w:t>
+      </w:r>
+      <w:r>
+        <w:rPr>
+          <w:lang w:val="es-ES"/>
+        </w:rPr>
+        <w:t>n en</w:t>
+      </w:r>
+      <w:r>
+        <w:rPr>
+          <w:lang w:val="es-ES"/>
+        </w:rPr>
+        <w:t xml:space="preserve"> </w:t>
+      </w:r>
+      <w:proofErr w:type="spellStart"/>
+      <w:r>
+        <w:rPr>
+          <w:b/>
+          <w:bCs/>
+          <w:lang w:val="es-ES"/>
+        </w:rPr>
+        <w:t>a_first_proyect</w:t>
+      </w:r>
+      <w:proofErr w:type="spellEnd"/>
+      <w:r>
+        <w:rPr>
+          <w:b/>
+          <w:bCs/>
+          <w:lang w:val="es-ES"/>
+        </w:rPr>
+        <w:t>/</w:t>
+      </w:r>
+      <w:proofErr w:type="spellStart"/>
+      <w:r>
+        <w:rPr>
+          <w:b/>
+          <w:bCs/>
+          <w:lang w:val="es-ES"/>
+        </w:rPr>
+        <w:t>a_</w:t>
+      </w:r>
+      <w:r>
+        <w:rPr>
+          <w:b/>
+          <w:bCs/>
+          <w:lang w:val="es-ES"/>
+        </w:rPr>
+        <w:t>app_name</w:t>
+      </w:r>
+      <w:proofErr w:type="spellEnd"/>
+      <w:r>
+        <w:rPr>
+          <w:b/>
+          <w:bCs/>
+          <w:lang w:val="es-ES"/>
+        </w:rPr>
+        <w:t>/</w:t>
+      </w:r>
+      <w:r>
+        <w:rPr>
+          <w:b/>
+          <w:bCs/>
+          <w:color w:val="00B0F0"/>
+          <w:lang w:val="es-ES"/>
+        </w:rPr>
+        <w:t>urls</w:t>
+      </w:r>
+      <w:r>
+        <w:rPr>
+          <w:b/>
+          <w:bCs/>
+          <w:color w:val="00B0F0"/>
+          <w:lang w:val="es-ES"/>
+        </w:rPr>
+        <w:t>.py</w:t>
+      </w:r>
+      <w:r>
+        <w:rPr>
+          <w:lang w:val="es-ES"/>
+        </w:rPr>
+        <w:t>, será</w:t>
+      </w:r>
+      <w:r>
+        <w:rPr>
+          <w:lang w:val="es-ES"/>
+        </w:rPr>
+        <w:t>n</w:t>
+      </w:r>
+      <w:r>
+        <w:rPr>
+          <w:lang w:val="es-ES"/>
+        </w:rPr>
+        <w:t xml:space="preserve"> </w:t>
+      </w:r>
+      <w:r>
+        <w:rPr>
+          <w:lang w:val="es-ES"/>
+        </w:rPr>
+        <w:t xml:space="preserve">los </w:t>
+      </w:r>
+      <w:r>
+        <w:rPr>
+          <w:lang w:val="es-ES"/>
+        </w:rPr>
+        <w:t>interno</w:t>
+      </w:r>
+      <w:r>
+        <w:rPr>
+          <w:lang w:val="es-ES"/>
+        </w:rPr>
+        <w:t>s</w:t>
+      </w:r>
+      <w:r>
+        <w:rPr>
+          <w:lang w:val="es-ES"/>
+        </w:rPr>
+        <w:t xml:space="preserve"> que est</w:t>
+      </w:r>
+      <w:r>
+        <w:rPr>
+          <w:lang w:val="es-ES"/>
+        </w:rPr>
+        <w:t>arán</w:t>
+      </w:r>
+      <w:r>
+        <w:rPr>
+          <w:lang w:val="es-ES"/>
+        </w:rPr>
+        <w:t xml:space="preserve"> contenido</w:t>
+      </w:r>
+      <w:r>
+        <w:rPr>
+          <w:lang w:val="es-ES"/>
+        </w:rPr>
+        <w:t>s</w:t>
+      </w:r>
+      <w:r>
+        <w:rPr>
+          <w:lang w:val="es-ES"/>
+        </w:rPr>
+        <w:t xml:space="preserve"> en el </w:t>
+      </w:r>
+      <w:proofErr w:type="spellStart"/>
+      <w:r>
+        <w:rPr>
+          <w:lang w:val="es-ES"/>
+        </w:rPr>
+        <w:t>endpoint</w:t>
+      </w:r>
+      <w:proofErr w:type="spellEnd"/>
+      <w:r>
+        <w:rPr>
+          <w:lang w:val="es-ES"/>
+        </w:rPr>
+        <w:t xml:space="preserve"> que se declare en el archivo urls.py del proyecto que se </w:t>
+      </w:r>
+      <w:r>
+        <w:rPr>
+          <w:lang w:val="es-MX"/>
+        </w:rPr>
+        <w:t xml:space="preserve">encuentra en </w:t>
+      </w:r>
+      <w:r>
+        <w:rPr>
+          <w:b/>
+          <w:bCs/>
+          <w:lang w:val="es-ES"/>
+        </w:rPr>
+        <w:t>a_first_proyect/a_first_proyect/</w:t>
+      </w:r>
+      <w:r>
+        <w:rPr>
+          <w:b/>
+          <w:bCs/>
+          <w:color w:val="00B0F0"/>
+          <w:lang w:val="es-ES"/>
+        </w:rPr>
+        <w:t>urls.py</w:t>
+      </w:r>
+      <w:r>
+        <w:rPr>
+          <w:lang w:val="es-MX"/>
+        </w:rPr>
+        <w:t>, al que se puede acceder a través del navegador, donde serán visibles estos.</w:t>
+      </w:r>
+    </w:p>
+    <w:p>
+      <w:pPr>
+        <w:jc w:val="center"/>
+        <w:rPr>
+          <w:lang w:val="es-MX"/>
+        </w:rPr>
+      </w:pPr>
+      <w:r>
+        <w:rPr>
+          <w:lang w:val="es-MX"/>
+        </w:rPr>
+        <w:t xml:space="preserve"> </w:t>
+      </w:r>
+      <w:r>
+        <w:rPr>
+          <w:lang w:val="es-MX"/>
+        </w:rPr>
+        <w:drawing>
+          <wp:inline distT="0" distB="0" distL="0" distR="0" wp14:anchorId="188A358B" wp14:editId="6C9E48AF">
+            <wp:extent cx="5943600" cy="3117850"/>
+            <wp:effectExtent l="0" t="0" r="0" b="6350"/>
+            <wp:docPr id="2062360475" name="Imagen 1"/>
+            <wp:cNvGraphicFramePr>
+              <a:graphicFrameLocks xmlns:a="http://schemas.openxmlformats.org/drawingml/2006/main" noChangeAspect="1"/>
+            </wp:cNvGraphicFramePr>
+            <a:graphic xmlns:a="http://schemas.openxmlformats.org/drawingml/2006/main">
+              <a:graphicData uri="http://schemas.openxmlformats.org/drawingml/2006/picture">
+                <pic:pic xmlns:pic="http://schemas.openxmlformats.org/drawingml/2006/picture">
+                  <pic:nvPicPr>
+                    <pic:cNvPr id="2062360475" name=""/>
+                    <pic:cNvPicPr/>
+                  </pic:nvPicPr>
+                  <pic:blipFill>
+                    <a:blip r:embed="rId35"/>
+                    <a:stretch>
+                      <a:fillRect/>
+                    </a:stretch>
+                  </pic:blipFill>
+                  <pic:spPr>
+                    <a:xfrm>
+                      <a:off x="0" y="0"/>
+                      <a:ext cx="5943600" cy="3117850"/>
+                    </a:xfrm>
+                    <a:prstGeom prst="rect">
+                      <a:avLst/>
+                    </a:prstGeom>
+                  </pic:spPr>
+                </pic:pic>
+              </a:graphicData>
+            </a:graphic>
+          </wp:inline>
+        </w:drawing>
+      </w:r>
+    </w:p>
+    <w:p>
+      <w:pPr>
+        <w:jc w:val="center"/>
+        <w:rPr>
+          <w:lang w:val="es-ES"/>
+        </w:rPr>
+      </w:pPr>
+      <w:r>
+        <w:rPr>
+          <w:lang w:val="es-ES"/>
+        </w:rPr>
+        <w:drawing>
+          <wp:inline distT="0" distB="0" distL="0" distR="0" wp14:anchorId="7DF04DBE" wp14:editId="5CB889F3">
+            <wp:extent cx="5943600" cy="1374140"/>
+            <wp:effectExtent l="0" t="0" r="0" b="0"/>
+            <wp:docPr id="1029504138" name="Imagen 1"/>
+            <wp:cNvGraphicFramePr>
+              <a:graphicFrameLocks xmlns:a="http://schemas.openxmlformats.org/drawingml/2006/main" noChangeAspect="1"/>
+            </wp:cNvGraphicFramePr>
+            <a:graphic xmlns:a="http://schemas.openxmlformats.org/drawingml/2006/main">
+              <a:graphicData uri="http://schemas.openxmlformats.org/drawingml/2006/picture">
+                <pic:pic xmlns:pic="http://schemas.openxmlformats.org/drawingml/2006/picture">
+                  <pic:nvPicPr>
+                    <pic:cNvPr id="1029504138" name=""/>
+                    <pic:cNvPicPr/>
+                  </pic:nvPicPr>
+                  <pic:blipFill>
+                    <a:blip r:embed="rId36"/>
+                    <a:stretch>
+                      <a:fillRect/>
+                    </a:stretch>
+                  </pic:blipFill>
+                  <pic:spPr>
+                    <a:xfrm>
+                      <a:off x="0" y="0"/>
+                      <a:ext cx="5943600" cy="1374140"/>
+                    </a:xfrm>
+                    <a:prstGeom prst="rect">
+                      <a:avLst/>
+                    </a:prstGeom>
+                  </pic:spPr>
+                </pic:pic>
+              </a:graphicData>
+            </a:graphic>
+          </wp:inline>
+        </w:drawing>
+      </w:r>
+    </w:p>
+    <w:p>
+      <w:pPr>
+        <w:jc w:val="center"/>
+        <w:rPr>
+          <w:lang w:val="es-ES"/>
+        </w:rPr>
+      </w:pPr>
+    </w:p>
+    <w:p>
+      <w:pPr>
+        <w:rPr>
+          <w:lang w:val="es-MX"/>
+        </w:rPr>
+      </w:pPr>
+    </w:p>
+    <w:p>
+      <w:pPr>
         <w:pStyle w:val="Ttulo1"/>
       </w:pPr>
-      <w:bookmarkStart w:id="6" w:name="_Toc229992088"/>
-      <w:r>
+      <w:bookmarkStart w:id="6" w:name="_Toc229992252"/>
+      <w:r>
+        <w:lastRenderedPageBreak/>
         <w:t>Referencias</w:t>
       </w:r>
       <w:bookmarkEnd w:id="6"/>
@@ -10722,7 +11915,7 @@
       </w:pPr>
     </w:p>
     <w:sectPr>
-      <w:footerReference w:type="default" r:id="rId32"/>
+      <w:footerReference w:type="default" r:id="rId37"/>
       <w:pgSz w:w="12240" w:h="15840" w:code="1"/>
       <w:pgMar w:top="1440" w:right="1440" w:bottom="1440" w:left="1440" w:header="720" w:footer="720" w:gutter="0"/>
       <w:pgNumType w:start="0"/>
@@ -12000,6 +13193,7 @@
   <w:style w:type="character" w:default="1" w:styleId="Fuentedeprrafopredeter">
     <w:name w:val="Default Paragraph Font"/>
     <w:uiPriority w:val="1"/>
+    <w:semiHidden/>
     <w:unhideWhenUsed/>
   </w:style>
   <w:style w:type="table" w:default="1" w:styleId="Tablanormal">
@@ -12741,10 +13935,6 @@
 </file>
 
 <file path=customXml/item1.xml><?xml version="1.0" encoding="utf-8"?>
-<b:Sources xmlns:b="http://schemas.openxmlformats.org/officeDocument/2006/bibliography" xmlns="http://schemas.openxmlformats.org/officeDocument/2006/bibliography" SelectedStyle="\APASixthEditionOfficeOnline.xsl" StyleName="APA" Version="6"/>
-</file>
-
-<file path=customXml/item2.xml><?xml version="1.0" encoding="utf-8"?>
 <s:customData xmlns="http://www.wps.cn/officeDocument/2013/wpsCustomData" xmlns:s="http://www.wps.cn/officeDocument/2013/wpsCustomData">
   <customSectProps>
     <customSectPr/>
@@ -12755,18 +13945,22 @@
 </s:customData>
 </file>
 
+<file path=customXml/item2.xml><?xml version="1.0" encoding="utf-8"?>
+<b:Sources xmlns:b="http://schemas.openxmlformats.org/officeDocument/2006/bibliography" xmlns="http://schemas.openxmlformats.org/officeDocument/2006/bibliography" SelectedStyle="\APASixthEditionOfficeOnline.xsl" StyleName="APA" Version="6"/>
+</file>
+
 <file path=customXml/itemProps1.xml><?xml version="1.0" encoding="utf-8"?>
+<ds:datastoreItem xmlns:ds="http://schemas.openxmlformats.org/officeDocument/2006/customXml" ds:itemID="{B1977F7D-205B-4081-913C-38D41E755F92}">
+  <ds:schemaRefs>
+    <ds:schemaRef ds:uri="http://www.wps.cn/officeDocument/2013/wpsCustomData"/>
+  </ds:schemaRefs>
+</ds:datastoreItem>
+</file>
+
+<file path=customXml/itemProps2.xml><?xml version="1.0" encoding="utf-8"?>
 <ds:datastoreItem xmlns:ds="http://schemas.openxmlformats.org/officeDocument/2006/customXml" ds:itemID="{851A7482-30F0-4AF0-9C85-18995F48D7BA}">
   <ds:schemaRefs>
     <ds:schemaRef ds:uri="http://schemas.openxmlformats.org/officeDocument/2006/bibliography"/>
   </ds:schemaRefs>
 </ds:datastoreItem>
-</file>
-
-<file path=customXml/itemProps2.xml><?xml version="1.0" encoding="utf-8"?>
-<ds:datastoreItem xmlns:ds="http://schemas.openxmlformats.org/officeDocument/2006/customXml" ds:itemID="{B1977F7D-205B-4081-913C-38D41E755F92}">
-  <ds:schemaRefs>
-    <ds:schemaRef ds:uri="http://www.wps.cn/officeDocument/2013/wpsCustomData"/>
-  </ds:schemaRefs>
-</ds:datastoreItem>
 </file>
</xml_diff>

<commit_message>
Finish of ULRs connection with Class Views
</commit_message>
<xml_diff>
--- a/00.-Introducción a Django.docx
+++ b/00.-Introducción a Django.docx
@@ -730,7 +730,7 @@
           <w:r>
             <w:fldChar w:fldCharType="separate"/>
           </w:r>
-          <w:hyperlink w:anchor="_Toc229992246" w:history="1">
+          <w:hyperlink w:anchor="_Toc230071734" w:history="1">
             <w:r>
               <w:rPr>
                 <w:rStyle w:val="Hipervnculo"/>
@@ -758,7 +758,7 @@
                 <w:noProof/>
                 <w:webHidden/>
               </w:rPr>
-              <w:instrText xml:space="preserve"> PAGEREF _Toc229992246 \h </w:instrText>
+              <w:instrText xml:space="preserve"> PAGEREF _Toc230071734 \h </w:instrText>
             </w:r>
             <w:r>
               <w:rPr>
@@ -804,7 +804,7 @@
               <w14:ligatures w14:val="standardContextual"/>
             </w:rPr>
           </w:pPr>
-          <w:hyperlink w:anchor="_Toc229992247" w:history="1">
+          <w:hyperlink w:anchor="_Toc230071735" w:history="1">
             <w:r>
               <w:rPr>
                 <w:rStyle w:val="Hipervnculo"/>
@@ -831,7 +831,7 @@
                 <w:noProof/>
                 <w:webHidden/>
               </w:rPr>
-              <w:instrText xml:space="preserve"> PAGEREF _Toc229992247 \h </w:instrText>
+              <w:instrText xml:space="preserve"> PAGEREF _Toc230071735 \h </w:instrText>
             </w:r>
             <w:r>
               <w:rPr>
@@ -877,7 +877,7 @@
               <w14:ligatures w14:val="standardContextual"/>
             </w:rPr>
           </w:pPr>
-          <w:hyperlink w:anchor="_Toc229992248" w:history="1">
+          <w:hyperlink w:anchor="_Toc230071736" w:history="1">
             <w:r>
               <w:rPr>
                 <w:rStyle w:val="Hipervnculo"/>
@@ -905,7 +905,7 @@
                 <w:noProof/>
                 <w:webHidden/>
               </w:rPr>
-              <w:instrText xml:space="preserve"> PAGEREF _Toc229992248 \h </w:instrText>
+              <w:instrText xml:space="preserve"> PAGEREF _Toc230071736 \h </w:instrText>
             </w:r>
             <w:r>
               <w:rPr>
@@ -951,7 +951,7 @@
               <w14:ligatures w14:val="standardContextual"/>
             </w:rPr>
           </w:pPr>
-          <w:hyperlink w:anchor="_Toc229992249" w:history="1">
+          <w:hyperlink w:anchor="_Toc230071737" w:history="1">
             <w:r>
               <w:rPr>
                 <w:rStyle w:val="Hipervnculo"/>
@@ -978,7 +978,7 @@
                 <w:noProof/>
                 <w:webHidden/>
               </w:rPr>
-              <w:instrText xml:space="preserve"> PAGEREF _Toc229992249 \h </w:instrText>
+              <w:instrText xml:space="preserve"> PAGEREF _Toc230071737 \h </w:instrText>
             </w:r>
             <w:r>
               <w:rPr>
@@ -1024,7 +1024,7 @@
               <w14:ligatures w14:val="standardContextual"/>
             </w:rPr>
           </w:pPr>
-          <w:hyperlink w:anchor="_Toc229992250" w:history="1">
+          <w:hyperlink w:anchor="_Toc230071738" w:history="1">
             <w:r>
               <w:rPr>
                 <w:rStyle w:val="Hipervnculo"/>
@@ -1051,7 +1051,7 @@
                 <w:noProof/>
                 <w:webHidden/>
               </w:rPr>
-              <w:instrText xml:space="preserve"> PAGEREF _Toc229992250 \h </w:instrText>
+              <w:instrText xml:space="preserve"> PAGEREF _Toc230071738 \h </w:instrText>
             </w:r>
             <w:r>
               <w:rPr>
@@ -1097,27 +1097,13 @@
               <w14:ligatures w14:val="standardContextual"/>
             </w:rPr>
           </w:pPr>
-          <w:hyperlink w:anchor="_Toc229992251" w:history="1">
+          <w:hyperlink w:anchor="_Toc230071739" w:history="1">
             <w:r>
               <w:rPr>
                 <w:rStyle w:val="Hipervnculo"/>
                 <w:noProof/>
               </w:rPr>
-              <w:t>URLs.py: Archivo de Configuraci</w:t>
-            </w:r>
-            <w:r>
-              <w:rPr>
-                <w:rStyle w:val="Hipervnculo"/>
-                <w:noProof/>
-              </w:rPr>
-              <w:t>ó</w:t>
-            </w:r>
-            <w:r>
-              <w:rPr>
-                <w:rStyle w:val="Hipervnculo"/>
-                <w:noProof/>
-              </w:rPr>
-              <w:t>n de Endpoints</w:t>
+              <w:t>URLs.py: Archivo de Configuración de Endpoints</w:t>
             </w:r>
             <w:r>
               <w:rPr>
@@ -1138,7 +1124,7 @@
                 <w:noProof/>
                 <w:webHidden/>
               </w:rPr>
-              <w:instrText xml:space="preserve"> PAGEREF _Toc229992251 \h </w:instrText>
+              <w:instrText xml:space="preserve"> PAGEREF _Toc230071739 \h </w:instrText>
             </w:r>
             <w:r>
               <w:rPr>
@@ -1171,6 +1157,79 @@
         </w:p>
         <w:p>
           <w:pPr>
+            <w:pStyle w:val="TDC3"/>
+            <w:tabs>
+              <w:tab w:val="right" w:leader="dot" w:pos="9350"/>
+            </w:tabs>
+            <w:rPr>
+              <w:noProof/>
+              <w:kern w:val="2"/>
+              <w:sz w:val="24"/>
+              <w:szCs w:val="24"/>
+              <w:lang w:val="es-MX" w:eastAsia="es-MX"/>
+              <w14:ligatures w14:val="standardContextual"/>
+            </w:rPr>
+          </w:pPr>
+          <w:hyperlink w:anchor="_Toc230071740" w:history="1">
+            <w:r>
+              <w:rPr>
+                <w:rStyle w:val="Hipervnculo"/>
+                <w:noProof/>
+              </w:rPr>
+              <w:t>Django Templates: Variables, Filtros y Tags</w:t>
+            </w:r>
+            <w:r>
+              <w:rPr>
+                <w:noProof/>
+                <w:webHidden/>
+              </w:rPr>
+              <w:tab/>
+            </w:r>
+            <w:r>
+              <w:rPr>
+                <w:noProof/>
+                <w:webHidden/>
+              </w:rPr>
+              <w:fldChar w:fldCharType="begin"/>
+            </w:r>
+            <w:r>
+              <w:rPr>
+                <w:noProof/>
+                <w:webHidden/>
+              </w:rPr>
+              <w:instrText xml:space="preserve"> PAGEREF _Toc230071740 \h </w:instrText>
+            </w:r>
+            <w:r>
+              <w:rPr>
+                <w:noProof/>
+                <w:webHidden/>
+              </w:rPr>
+            </w:r>
+            <w:r>
+              <w:rPr>
+                <w:noProof/>
+                <w:webHidden/>
+              </w:rPr>
+              <w:fldChar w:fldCharType="separate"/>
+            </w:r>
+            <w:r>
+              <w:rPr>
+                <w:noProof/>
+                <w:webHidden/>
+              </w:rPr>
+              <w:t>16</w:t>
+            </w:r>
+            <w:r>
+              <w:rPr>
+                <w:noProof/>
+                <w:webHidden/>
+              </w:rPr>
+              <w:fldChar w:fldCharType="end"/>
+            </w:r>
+          </w:hyperlink>
+        </w:p>
+        <w:p>
+          <w:pPr>
             <w:pStyle w:val="TDC1"/>
             <w:tabs>
               <w:tab w:val="right" w:leader="dot" w:pos="9350"/>
@@ -1184,7 +1243,94 @@
               <w14:ligatures w14:val="standardContextual"/>
             </w:rPr>
           </w:pPr>
-          <w:hyperlink w:anchor="_Toc229992252" w:history="1">
+          <w:hyperlink w:anchor="_Toc230071741" w:history="1">
+            <w:r>
+              <w:rPr>
+                <w:rStyle w:val="Hipervnculo"/>
+                <w:noProof/>
+              </w:rPr>
+              <w:t>Ejemplo</w:t>
+            </w:r>
+            <w:r>
+              <w:rPr>
+                <w:rStyle w:val="Hipervnculo"/>
+                <w:noProof/>
+              </w:rPr>
+              <w:t>:</w:t>
+            </w:r>
+            <w:r>
+              <w:rPr>
+                <w:rStyle w:val="Hipervnculo"/>
+                <w:noProof/>
+              </w:rPr>
+              <w:t xml:space="preserve"> Proyecto Coffee Shop</w:t>
+            </w:r>
+            <w:r>
+              <w:rPr>
+                <w:noProof/>
+                <w:webHidden/>
+              </w:rPr>
+              <w:tab/>
+            </w:r>
+            <w:r>
+              <w:rPr>
+                <w:noProof/>
+                <w:webHidden/>
+              </w:rPr>
+              <w:fldChar w:fldCharType="begin"/>
+            </w:r>
+            <w:r>
+              <w:rPr>
+                <w:noProof/>
+                <w:webHidden/>
+              </w:rPr>
+              <w:instrText xml:space="preserve"> PAGEREF _Toc230071741 \h </w:instrText>
+            </w:r>
+            <w:r>
+              <w:rPr>
+                <w:noProof/>
+                <w:webHidden/>
+              </w:rPr>
+            </w:r>
+            <w:r>
+              <w:rPr>
+                <w:noProof/>
+                <w:webHidden/>
+              </w:rPr>
+              <w:fldChar w:fldCharType="separate"/>
+            </w:r>
+            <w:r>
+              <w:rPr>
+                <w:noProof/>
+                <w:webHidden/>
+              </w:rPr>
+              <w:t>16</w:t>
+            </w:r>
+            <w:r>
+              <w:rPr>
+                <w:noProof/>
+                <w:webHidden/>
+              </w:rPr>
+              <w:fldChar w:fldCharType="end"/>
+            </w:r>
+          </w:hyperlink>
+        </w:p>
+        <w:p>
+          <w:pPr>
+            <w:pStyle w:val="TDC1"/>
+            <w:tabs>
+              <w:tab w:val="right" w:leader="dot" w:pos="9350"/>
+            </w:tabs>
+            <w:rPr>
+              <w:noProof/>
+              <w:kern w:val="2"/>
+              <w:sz w:val="24"/>
+              <w:szCs w:val="24"/>
+              <w:lang w:val="es-MX" w:eastAsia="es-MX"/>
+              <w14:ligatures w14:val="standardContextual"/>
+            </w:rPr>
+          </w:pPr>
+          <w:hyperlink w:anchor="_Toc230071742" w:history="1">
             <w:r>
               <w:rPr>
                 <w:rStyle w:val="Hipervnculo"/>
@@ -1211,7 +1357,7 @@
                 <w:noProof/>
                 <w:webHidden/>
               </w:rPr>
-              <w:instrText xml:space="preserve"> PAGEREF _Toc229992252 \h </w:instrText>
+              <w:instrText xml:space="preserve"> PAGEREF _Toc230071742 \h </w:instrText>
             </w:r>
             <w:r>
               <w:rPr>
@@ -1231,7 +1377,7 @@
                 <w:noProof/>
                 <w:webHidden/>
               </w:rPr>
-              <w:t>13</w:t>
+              <w:t>16</w:t>
             </w:r>
             <w:r>
               <w:rPr>
@@ -1272,7 +1418,7 @@
           <w:lang w:val="es-MX"/>
         </w:rPr>
       </w:pPr>
-      <w:bookmarkStart w:id="0" w:name="_Toc229992246"/>
+      <w:bookmarkStart w:id="0" w:name="_Toc230071734"/>
       <w:r>
         <w:rPr>
           <w:lang w:val="es-MX"/>
@@ -3121,7 +3267,7 @@
       <w:pPr>
         <w:pStyle w:val="Ttulo1"/>
       </w:pPr>
-      <w:bookmarkStart w:id="1" w:name="_Toc229992247"/>
+      <w:bookmarkStart w:id="1" w:name="_Toc230071735"/>
       <w:r>
         <w:t xml:space="preserve">Arquitectura MVT (Model View </w:t>
       </w:r>
@@ -6394,7 +6540,7 @@
           <w:lang w:val="es-MX"/>
         </w:rPr>
       </w:pPr>
-      <w:bookmarkStart w:id="2" w:name="_Toc229992248"/>
+      <w:bookmarkStart w:id="2" w:name="_Toc230071736"/>
       <w:r>
         <w:rPr>
           <w:lang w:val="es-MX"/>
@@ -7533,7 +7679,7 @@
       <w:pPr>
         <w:pStyle w:val="Ttulo3"/>
       </w:pPr>
-      <w:bookmarkStart w:id="3" w:name="_Toc229992249"/>
+      <w:bookmarkStart w:id="3" w:name="_Toc230071737"/>
       <w:r>
         <w:lastRenderedPageBreak/>
         <w:t>Base de Datos SQLite</w:t>
@@ -8160,7 +8306,7 @@
           <w:color w:val="BBBEBF"/>
           <w:sz w:val="21"/>
           <w:szCs w:val="21"/>
-          <w:lang w:val="es-MX" w:eastAsia="es-MX"/>
+          <w:lang w:eastAsia="es-MX"/>
         </w:rPr>
       </w:pPr>
       <w:r>
@@ -8179,11 +8325,69 @@
           <w:color w:val="A5D6FF"/>
           <w:sz w:val="21"/>
           <w:szCs w:val="21"/>
-          <w:lang w:val="es-MX" w:eastAsia="es-MX"/>
+          <w:lang w:eastAsia="es-MX"/>
         </w:rPr>
         <w:t>'ENGINE'</w:t>
       </w:r>
       <w:r>
+        <w:rPr>
+          <w:rFonts w:ascii="Consolas" w:eastAsia="Times New Roman" w:hAnsi="Consolas" w:cs="Times New Roman"/>
+          <w:color w:val="BBBEBF"/>
+          <w:sz w:val="21"/>
+          <w:szCs w:val="21"/>
+          <w:lang w:eastAsia="es-MX"/>
+        </w:rPr>
+        <w:t xml:space="preserve">: </w:t>
+      </w:r>
+      <w:r>
+        <w:rPr>
+          <w:rFonts w:ascii="Consolas" w:eastAsia="Times New Roman" w:hAnsi="Consolas" w:cs="Times New Roman"/>
+          <w:color w:val="A5D6FF"/>
+          <w:sz w:val="21"/>
+          <w:szCs w:val="21"/>
+          <w:lang w:eastAsia="es-MX"/>
+        </w:rPr>
+        <w:t>'django.</w:t>
+      </w:r>
+      <w:proofErr w:type="gramStart"/>
+      <w:r>
+        <w:rPr>
+          <w:rFonts w:ascii="Consolas" w:eastAsia="Times New Roman" w:hAnsi="Consolas" w:cs="Times New Roman"/>
+          <w:color w:val="A5D6FF"/>
+          <w:sz w:val="21"/>
+          <w:szCs w:val="21"/>
+          <w:lang w:eastAsia="es-MX"/>
+        </w:rPr>
+        <w:t>db.backends</w:t>
+      </w:r>
+      <w:proofErr w:type="gramEnd"/>
+      <w:r>
+        <w:rPr>
+          <w:rFonts w:ascii="Consolas" w:eastAsia="Times New Roman" w:hAnsi="Consolas" w:cs="Times New Roman"/>
+          <w:color w:val="A5D6FF"/>
+          <w:sz w:val="21"/>
+          <w:szCs w:val="21"/>
+          <w:lang w:eastAsia="es-MX"/>
+        </w:rPr>
+        <w:t>.sqlite3'</w:t>
+      </w:r>
+      <w:r>
+        <w:rPr>
+          <w:rFonts w:ascii="Consolas" w:eastAsia="Times New Roman" w:hAnsi="Consolas" w:cs="Times New Roman"/>
+          <w:color w:val="BBBEBF"/>
+          <w:sz w:val="21"/>
+          <w:szCs w:val="21"/>
+          <w:lang w:eastAsia="es-MX"/>
+        </w:rPr>
+        <w:t>,</w:t>
+      </w:r>
+    </w:p>
+    <w:p>
+      <w:pPr>
+        <w:shd w:val="clear" w:color="auto" w:fill="121314"/>
+        <w:spacing w:after="0" w:line="285" w:lineRule="atLeast"/>
+        <w:ind w:left="720"/>
+        <w:jc w:val="left"/>
         <w:rPr>
           <w:rFonts w:ascii="Consolas" w:eastAsia="Times New Roman" w:hAnsi="Consolas" w:cs="Times New Roman"/>
           <w:color w:val="BBBEBF"/>
@@ -8191,72 +8395,14 @@
           <w:szCs w:val="21"/>
           <w:lang w:val="es-MX" w:eastAsia="es-MX"/>
         </w:rPr>
-        <w:t xml:space="preserve">: </w:t>
-      </w:r>
-      <w:r>
-        <w:rPr>
-          <w:rFonts w:ascii="Consolas" w:eastAsia="Times New Roman" w:hAnsi="Consolas" w:cs="Times New Roman"/>
-          <w:color w:val="A5D6FF"/>
-          <w:sz w:val="21"/>
-          <w:szCs w:val="21"/>
-          <w:lang w:val="es-MX" w:eastAsia="es-MX"/>
-        </w:rPr>
-        <w:t>'django.</w:t>
-      </w:r>
-      <w:proofErr w:type="gramStart"/>
-      <w:r>
-        <w:rPr>
-          <w:rFonts w:ascii="Consolas" w:eastAsia="Times New Roman" w:hAnsi="Consolas" w:cs="Times New Roman"/>
-          <w:color w:val="A5D6FF"/>
-          <w:sz w:val="21"/>
-          <w:szCs w:val="21"/>
-          <w:lang w:val="es-MX" w:eastAsia="es-MX"/>
-        </w:rPr>
-        <w:t>db.backends</w:t>
-      </w:r>
-      <w:proofErr w:type="gramEnd"/>
-      <w:r>
-        <w:rPr>
-          <w:rFonts w:ascii="Consolas" w:eastAsia="Times New Roman" w:hAnsi="Consolas" w:cs="Times New Roman"/>
-          <w:color w:val="A5D6FF"/>
-          <w:sz w:val="21"/>
-          <w:szCs w:val="21"/>
-          <w:lang w:val="es-MX" w:eastAsia="es-MX"/>
-        </w:rPr>
-        <w:t>.sqlite3'</w:t>
-      </w:r>
+      </w:pPr>
       <w:r>
         <w:rPr>
           <w:rFonts w:ascii="Consolas" w:eastAsia="Times New Roman" w:hAnsi="Consolas" w:cs="Times New Roman"/>
           <w:color w:val="BBBEBF"/>
           <w:sz w:val="21"/>
           <w:szCs w:val="21"/>
-          <w:lang w:val="es-MX" w:eastAsia="es-MX"/>
-        </w:rPr>
-        <w:t>,</w:t>
-      </w:r>
-    </w:p>
-    <w:p>
-      <w:pPr>
-        <w:shd w:val="clear" w:color="auto" w:fill="121314"/>
-        <w:spacing w:after="0" w:line="285" w:lineRule="atLeast"/>
-        <w:ind w:left="720"/>
-        <w:jc w:val="left"/>
-        <w:rPr>
-          <w:rFonts w:ascii="Consolas" w:eastAsia="Times New Roman" w:hAnsi="Consolas" w:cs="Times New Roman"/>
-          <w:color w:val="BBBEBF"/>
-          <w:sz w:val="21"/>
-          <w:szCs w:val="21"/>
-          <w:lang w:val="es-MX" w:eastAsia="es-MX"/>
-        </w:rPr>
-      </w:pPr>
-      <w:r>
-        <w:rPr>
-          <w:rFonts w:ascii="Consolas" w:eastAsia="Times New Roman" w:hAnsi="Consolas" w:cs="Times New Roman"/>
-          <w:color w:val="BBBEBF"/>
-          <w:sz w:val="21"/>
-          <w:szCs w:val="21"/>
-          <w:lang w:val="es-MX" w:eastAsia="es-MX"/>
+          <w:lang w:eastAsia="es-MX"/>
         </w:rPr>
         <w:t xml:space="preserve">        </w:t>
       </w:r>
@@ -9694,7 +9840,7 @@
       <w:pPr>
         <w:pStyle w:val="Ttulo3"/>
       </w:pPr>
-      <w:bookmarkStart w:id="4" w:name="_Toc229992250"/>
+      <w:bookmarkStart w:id="4" w:name="_Toc230071738"/>
       <w:r>
         <w:t>Tipos de Relaciones entre Tablas: Uno a Muchos, Muchos a Muchos y Uno a Uno</w:t>
       </w:r>
@@ -10332,7 +10478,7 @@
       <w:pPr>
         <w:pStyle w:val="Ttulo3"/>
       </w:pPr>
-      <w:bookmarkStart w:id="5" w:name="_Toc229992251"/>
+      <w:bookmarkStart w:id="5" w:name="_Toc230071739"/>
       <w:r>
         <w:t xml:space="preserve">URLs.py: Archivo de Configuración de </w:t>
       </w:r>
@@ -10698,6 +10844,7 @@
       </w:pPr>
       <w:r>
         <w:rPr>
+          <w:noProof/>
           <w:lang w:val="es-ES"/>
         </w:rPr>
         <w:drawing>
@@ -11393,6 +11540,7 @@
       </w:pPr>
       <w:r>
         <w:rPr>
+          <w:noProof/>
           <w:lang w:val="es-ES"/>
         </w:rPr>
         <w:drawing>
@@ -11441,6 +11589,7 @@
       </w:pPr>
       <w:r>
         <w:rPr>
+          <w:noProof/>
           <w:lang w:val="es-ES"/>
         </w:rPr>
         <w:lastRenderedPageBreak/>
@@ -11699,19 +11848,13 @@
     </w:p>
     <w:p>
       <w:pPr>
-        <w:jc w:val="center"/>
-        <w:rPr>
-          <w:lang w:val="es-MX"/>
-        </w:rPr>
-      </w:pPr>
-      <w:r>
-        <w:rPr>
-          <w:lang w:val="es-MX"/>
-        </w:rPr>
-        <w:t xml:space="preserve"> </w:t>
-      </w:r>
-      <w:r>
-        <w:rPr>
+        <w:rPr>
+          <w:lang w:val="es-MX"/>
+        </w:rPr>
+      </w:pPr>
+      <w:r>
+        <w:rPr>
+          <w:noProof/>
           <w:lang w:val="es-MX"/>
         </w:rPr>
         <w:drawing>
@@ -11760,6 +11903,7 @@
       </w:pPr>
       <w:r>
         <w:rPr>
+          <w:noProof/>
           <w:lang w:val="es-ES"/>
         </w:rPr>
         <w:drawing>
@@ -11801,121 +11945,1311 @@
     </w:p>
     <w:p>
       <w:pPr>
-        <w:jc w:val="center"/>
-        <w:rPr>
-          <w:lang w:val="es-ES"/>
-        </w:rPr>
-      </w:pPr>
+        <w:rPr>
+          <w:lang w:val="es-MX"/>
+        </w:rPr>
+      </w:pPr>
+      <w:r>
+        <w:rPr>
+          <w:lang w:val="es-ES"/>
+        </w:rPr>
+        <w:t xml:space="preserve">Vale la pena mencionar que de igual forma se pueden incluir valores variables dentro de nuestros </w:t>
+      </w:r>
+      <w:proofErr w:type="spellStart"/>
+      <w:r>
+        <w:rPr>
+          <w:lang w:val="es-ES"/>
+        </w:rPr>
+        <w:t>endpoints</w:t>
+      </w:r>
+      <w:proofErr w:type="spellEnd"/>
+      <w:r>
+        <w:rPr>
+          <w:lang w:val="es-ES"/>
+        </w:rPr>
+        <w:t xml:space="preserve"> cuando se declaren en los archivos </w:t>
+      </w:r>
+      <w:r>
+        <w:rPr>
+          <w:b/>
+          <w:bCs/>
+          <w:color w:val="00B0F0"/>
+          <w:lang w:val="es-ES"/>
+        </w:rPr>
+        <w:t>urls.py</w:t>
+      </w:r>
+      <w:r>
+        <w:rPr>
+          <w:lang w:val="es-ES"/>
+        </w:rPr>
+        <w:t xml:space="preserve"> a través de la sintaxis: </w:t>
+      </w:r>
+      <w:proofErr w:type="spellStart"/>
+      <w:proofErr w:type="gramStart"/>
+      <w:r>
+        <w:rPr>
+          <w:b/>
+          <w:bCs/>
+          <w:lang w:val="es-ES"/>
+        </w:rPr>
+        <w:t>path</w:t>
+      </w:r>
+      <w:proofErr w:type="spellEnd"/>
+      <w:r>
+        <w:rPr>
+          <w:b/>
+          <w:bCs/>
+          <w:lang w:val="es-ES"/>
+        </w:rPr>
+        <w:t>(</w:t>
+      </w:r>
+      <w:proofErr w:type="gramEnd"/>
+      <w:r>
+        <w:rPr>
+          <w:b/>
+          <w:bCs/>
+          <w:color w:val="00B050"/>
+          <w:lang w:val="es-ES"/>
+        </w:rPr>
+        <w:t>"</w:t>
+      </w:r>
+      <w:proofErr w:type="spellStart"/>
+      <w:r>
+        <w:rPr>
+          <w:b/>
+          <w:bCs/>
+          <w:color w:val="00B050"/>
+          <w:lang w:val="es-ES"/>
+        </w:rPr>
+        <w:t>endpoint</w:t>
+      </w:r>
+      <w:proofErr w:type="spellEnd"/>
+      <w:r>
+        <w:rPr>
+          <w:b/>
+          <w:bCs/>
+          <w:color w:val="00B050"/>
+          <w:lang w:val="es-ES"/>
+        </w:rPr>
+        <w:t>/&lt;</w:t>
+      </w:r>
+      <w:proofErr w:type="spellStart"/>
+      <w:r>
+        <w:rPr>
+          <w:b/>
+          <w:bCs/>
+          <w:color w:val="00B050"/>
+          <w:lang w:val="es-ES"/>
+        </w:rPr>
+        <w:t>tipo_de_</w:t>
+      </w:r>
+      <w:proofErr w:type="gramStart"/>
+      <w:r>
+        <w:rPr>
+          <w:b/>
+          <w:bCs/>
+          <w:color w:val="00B050"/>
+          <w:lang w:val="es-ES"/>
+        </w:rPr>
+        <w:t>dato</w:t>
+      </w:r>
+      <w:proofErr w:type="spellEnd"/>
+      <w:r>
+        <w:rPr>
+          <w:b/>
+          <w:bCs/>
+          <w:color w:val="00B050"/>
+          <w:lang w:val="es-ES"/>
+        </w:rPr>
+        <w:t xml:space="preserve"> :</w:t>
+      </w:r>
+      <w:proofErr w:type="gramEnd"/>
+      <w:r>
+        <w:rPr>
+          <w:b/>
+          <w:bCs/>
+          <w:color w:val="00B050"/>
+          <w:lang w:val="es-ES"/>
+        </w:rPr>
+        <w:t xml:space="preserve"> </w:t>
+      </w:r>
+      <w:proofErr w:type="spellStart"/>
+      <w:r>
+        <w:rPr>
+          <w:b/>
+          <w:bCs/>
+          <w:color w:val="00B050"/>
+          <w:lang w:val="es-ES"/>
+        </w:rPr>
+        <w:t>nombre_variable</w:t>
+      </w:r>
+      <w:proofErr w:type="spellEnd"/>
+      <w:r>
+        <w:rPr>
+          <w:b/>
+          <w:bCs/>
+          <w:color w:val="00B050"/>
+          <w:lang w:val="es-ES"/>
+        </w:rPr>
+        <w:t>&gt;/"</w:t>
+      </w:r>
+      <w:r>
+        <w:rPr>
+          <w:b/>
+          <w:bCs/>
+          <w:lang w:val="es-ES"/>
+        </w:rPr>
+        <w:t xml:space="preserve">, </w:t>
+      </w:r>
+      <w:proofErr w:type="spellStart"/>
+      <w:r>
+        <w:rPr>
+          <w:b/>
+          <w:bCs/>
+          <w:color w:val="7030A0"/>
+          <w:lang w:val="es-ES"/>
+        </w:rPr>
+        <w:t>mi_view</w:t>
+      </w:r>
+      <w:proofErr w:type="spellEnd"/>
+      <w:r>
+        <w:rPr>
+          <w:b/>
+          <w:bCs/>
+          <w:lang w:val="es-ES"/>
+        </w:rPr>
+        <w:t>)</w:t>
+      </w:r>
     </w:p>
     <w:p>
       <w:pPr>
         <w:rPr>
-          <w:lang w:val="es-MX"/>
-        </w:rPr>
-      </w:pPr>
+          <w:lang w:val="es-ES"/>
+        </w:rPr>
+      </w:pPr>
+      <w:r>
+        <w:rPr>
+          <w:lang w:val="es-ES"/>
+        </w:rPr>
+        <w:lastRenderedPageBreak/>
+        <w:t xml:space="preserve">Pero las </w:t>
+      </w:r>
+      <w:r>
+        <w:rPr>
+          <w:b/>
+          <w:bCs/>
+          <w:lang w:val="es-ES"/>
+        </w:rPr>
+        <w:t xml:space="preserve">funciones de tipo </w:t>
+      </w:r>
+      <w:r>
+        <w:rPr>
+          <w:b/>
+          <w:bCs/>
+          <w:color w:val="7030A0"/>
+          <w:lang w:val="es-ES"/>
+        </w:rPr>
+        <w:t xml:space="preserve">vista </w:t>
+      </w:r>
+      <w:r>
+        <w:rPr>
+          <w:b/>
+          <w:bCs/>
+          <w:lang w:val="es-ES"/>
+        </w:rPr>
+        <w:t>(</w:t>
+      </w:r>
+      <w:proofErr w:type="spellStart"/>
+      <w:r>
+        <w:rPr>
+          <w:b/>
+          <w:bCs/>
+          <w:color w:val="7030A0"/>
+          <w:lang w:val="es-ES"/>
+        </w:rPr>
+        <w:t>mi_view</w:t>
+      </w:r>
+      <w:proofErr w:type="spellEnd"/>
+      <w:r>
+        <w:rPr>
+          <w:b/>
+          <w:bCs/>
+          <w:lang w:val="es-ES"/>
+        </w:rPr>
+        <w:t>)</w:t>
+      </w:r>
+      <w:r>
+        <w:rPr>
+          <w:lang w:val="es-ES"/>
+        </w:rPr>
+        <w:t xml:space="preserve"> que estas utilicen deben de no solo recibir el parámetro </w:t>
+      </w:r>
+      <w:proofErr w:type="spellStart"/>
+      <w:r>
+        <w:rPr>
+          <w:b/>
+          <w:bCs/>
+          <w:lang w:val="es-ES"/>
+        </w:rPr>
+        <w:t>request</w:t>
+      </w:r>
+      <w:proofErr w:type="spellEnd"/>
+      <w:r>
+        <w:rPr>
+          <w:lang w:val="es-ES"/>
+        </w:rPr>
+        <w:t xml:space="preserve">, sino que también reciben </w:t>
+      </w:r>
+      <w:r>
+        <w:rPr>
+          <w:b/>
+          <w:bCs/>
+          <w:lang w:val="es-ES"/>
+        </w:rPr>
+        <w:t>*</w:t>
+      </w:r>
+      <w:proofErr w:type="spellStart"/>
+      <w:r>
+        <w:rPr>
+          <w:b/>
+          <w:bCs/>
+          <w:lang w:val="es-ES"/>
+        </w:rPr>
+        <w:t>args</w:t>
+      </w:r>
+      <w:proofErr w:type="spellEnd"/>
+      <w:r>
+        <w:rPr>
+          <w:b/>
+          <w:bCs/>
+          <w:lang w:val="es-ES"/>
+        </w:rPr>
+        <w:t xml:space="preserve"> </w:t>
+      </w:r>
+      <w:r>
+        <w:rPr>
+          <w:lang w:val="es-ES"/>
+        </w:rPr>
+        <w:t>y</w:t>
+      </w:r>
+      <w:r>
+        <w:rPr>
+          <w:b/>
+          <w:bCs/>
+          <w:lang w:val="es-ES"/>
+        </w:rPr>
+        <w:t xml:space="preserve"> </w:t>
+      </w:r>
+      <w:r>
+        <w:rPr>
+          <w:b/>
+          <w:bCs/>
+          <w:lang w:val="es-ES"/>
+        </w:rPr>
+        <w:t>*</w:t>
+      </w:r>
+      <w:proofErr w:type="spellStart"/>
+      <w:r>
+        <w:rPr>
+          <w:b/>
+          <w:bCs/>
+          <w:lang w:val="es-ES"/>
+        </w:rPr>
+        <w:t>k</w:t>
+      </w:r>
+      <w:r>
+        <w:rPr>
+          <w:b/>
+          <w:bCs/>
+          <w:lang w:val="es-ES"/>
+        </w:rPr>
+        <w:t>args</w:t>
+      </w:r>
+      <w:proofErr w:type="spellEnd"/>
+      <w:r>
+        <w:rPr>
+          <w:lang w:val="es-ES"/>
+        </w:rPr>
+        <w:t xml:space="preserve">, que corresponden a una tupla y un diccionario que muestran el valor que se está asignando a dichas variables de los </w:t>
+      </w:r>
+      <w:proofErr w:type="spellStart"/>
+      <w:r>
+        <w:rPr>
+          <w:lang w:val="es-ES"/>
+        </w:rPr>
+        <w:t>endpoints</w:t>
+      </w:r>
+      <w:proofErr w:type="spellEnd"/>
+      <w:r>
+        <w:rPr>
+          <w:lang w:val="es-ES"/>
+        </w:rPr>
+        <w:t xml:space="preserve"> a través de la URL del </w:t>
+      </w:r>
+      <w:proofErr w:type="spellStart"/>
+      <w:r>
+        <w:rPr>
+          <w:lang w:val="es-ES"/>
+        </w:rPr>
+        <w:t>reqest</w:t>
+      </w:r>
+      <w:proofErr w:type="spellEnd"/>
+      <w:r>
+        <w:rPr>
+          <w:lang w:val="es-ES"/>
+        </w:rPr>
+        <w:t>.</w:t>
+      </w:r>
     </w:p>
     <w:p>
       <w:pPr>
-        <w:pStyle w:val="Ttulo1"/>
-      </w:pPr>
-      <w:bookmarkStart w:id="6" w:name="_Toc229992252"/>
+        <w:jc w:val="center"/>
+        <w:rPr>
+          <w:lang w:val="es-ES"/>
+        </w:rPr>
+      </w:pPr>
+      <w:r>
+        <w:rPr>
+          <w:lang w:val="es-ES"/>
+        </w:rPr>
+        <w:drawing>
+          <wp:inline distT="0" distB="0" distL="0" distR="0" wp14:anchorId="28A36FD5" wp14:editId="12B57DB4">
+            <wp:extent cx="5943600" cy="2223770"/>
+            <wp:effectExtent l="0" t="0" r="0" b="5080"/>
+            <wp:docPr id="509887716" name="Imagen 1"/>
+            <wp:cNvGraphicFramePr>
+              <a:graphicFrameLocks xmlns:a="http://schemas.openxmlformats.org/drawingml/2006/main" noChangeAspect="1"/>
+            </wp:cNvGraphicFramePr>
+            <a:graphic xmlns:a="http://schemas.openxmlformats.org/drawingml/2006/main">
+              <a:graphicData uri="http://schemas.openxmlformats.org/drawingml/2006/picture">
+                <pic:pic xmlns:pic="http://schemas.openxmlformats.org/drawingml/2006/picture">
+                  <pic:nvPicPr>
+                    <pic:cNvPr id="509887716" name=""/>
+                    <pic:cNvPicPr/>
+                  </pic:nvPicPr>
+                  <pic:blipFill rotWithShape="1">
+                    <a:blip r:embed="rId37"/>
+                    <a:srcRect t="5810"/>
+                    <a:stretch>
+                      <a:fillRect/>
+                    </a:stretch>
+                  </pic:blipFill>
+                  <pic:spPr bwMode="auto">
+                    <a:xfrm>
+                      <a:off x="0" y="0"/>
+                      <a:ext cx="5943600" cy="2223770"/>
+                    </a:xfrm>
+                    <a:prstGeom prst="rect">
+                      <a:avLst/>
+                    </a:prstGeom>
+                    <a:ln>
+                      <a:noFill/>
+                    </a:ln>
+                    <a:extLst>
+                      <a:ext uri="{53640926-AAD7-44D8-BBD7-CCE9431645EC}">
+                        <a14:shadowObscured xmlns:a14="http://schemas.microsoft.com/office/drawing/2010/main"/>
+                      </a:ext>
+                    </a:extLst>
+                  </pic:spPr>
+                </pic:pic>
+              </a:graphicData>
+            </a:graphic>
+          </wp:inline>
+        </w:drawing>
+      </w:r>
+    </w:p>
+    <w:p>
+      <w:pPr>
+        <w:jc w:val="center"/>
+        <w:rPr>
+          <w:lang w:val="es-ES"/>
+        </w:rPr>
+      </w:pPr>
+      <w:r>
+        <w:rPr>
+          <w:lang w:val="es-ES"/>
+        </w:rPr>
+        <w:drawing>
+          <wp:inline distT="0" distB="0" distL="0" distR="0" wp14:anchorId="09E6EE55" wp14:editId="7FC6DBCB">
+            <wp:extent cx="5943600" cy="434340"/>
+            <wp:effectExtent l="0" t="0" r="0" b="3810"/>
+            <wp:docPr id="145832363" name="Imagen 1"/>
+            <wp:cNvGraphicFramePr>
+              <a:graphicFrameLocks xmlns:a="http://schemas.openxmlformats.org/drawingml/2006/main" noChangeAspect="1"/>
+            </wp:cNvGraphicFramePr>
+            <a:graphic xmlns:a="http://schemas.openxmlformats.org/drawingml/2006/main">
+              <a:graphicData uri="http://schemas.openxmlformats.org/drawingml/2006/picture">
+                <pic:pic xmlns:pic="http://schemas.openxmlformats.org/drawingml/2006/picture">
+                  <pic:nvPicPr>
+                    <pic:cNvPr id="145832363" name=""/>
+                    <pic:cNvPicPr/>
+                  </pic:nvPicPr>
+                  <pic:blipFill rotWithShape="1">
+                    <a:blip r:embed="rId38"/>
+                    <a:srcRect b="18474"/>
+                    <a:stretch>
+                      <a:fillRect/>
+                    </a:stretch>
+                  </pic:blipFill>
+                  <pic:spPr bwMode="auto">
+                    <a:xfrm>
+                      <a:off x="0" y="0"/>
+                      <a:ext cx="5943600" cy="434340"/>
+                    </a:xfrm>
+                    <a:prstGeom prst="rect">
+                      <a:avLst/>
+                    </a:prstGeom>
+                    <a:ln>
+                      <a:noFill/>
+                    </a:ln>
+                    <a:extLst>
+                      <a:ext uri="{53640926-AAD7-44D8-BBD7-CCE9431645EC}">
+                        <a14:shadowObscured xmlns:a14="http://schemas.microsoft.com/office/drawing/2010/main"/>
+                      </a:ext>
+                    </a:extLst>
+                  </pic:spPr>
+                </pic:pic>
+              </a:graphicData>
+            </a:graphic>
+          </wp:inline>
+        </w:drawing>
+      </w:r>
+    </w:p>
+    <w:p>
+      <w:pPr>
+        <w:jc w:val="center"/>
+        <w:rPr>
+          <w:lang w:val="es-ES"/>
+        </w:rPr>
+      </w:pPr>
+      <w:r>
+        <w:rPr>
+          <w:lang w:val="es-ES"/>
+        </w:rPr>
+        <w:drawing>
+          <wp:inline distT="0" distB="0" distL="0" distR="0" wp14:anchorId="03461B5F" wp14:editId="496D247D">
+            <wp:extent cx="5943600" cy="3030220"/>
+            <wp:effectExtent l="0" t="0" r="0" b="0"/>
+            <wp:docPr id="1765530823" name="Imagen 1"/>
+            <wp:cNvGraphicFramePr>
+              <a:graphicFrameLocks xmlns:a="http://schemas.openxmlformats.org/drawingml/2006/main" noChangeAspect="1"/>
+            </wp:cNvGraphicFramePr>
+            <a:graphic xmlns:a="http://schemas.openxmlformats.org/drawingml/2006/main">
+              <a:graphicData uri="http://schemas.openxmlformats.org/drawingml/2006/picture">
+                <pic:pic xmlns:pic="http://schemas.openxmlformats.org/drawingml/2006/picture">
+                  <pic:nvPicPr>
+                    <pic:cNvPr id="1765530823" name=""/>
+                    <pic:cNvPicPr/>
+                  </pic:nvPicPr>
+                  <pic:blipFill rotWithShape="1">
+                    <a:blip r:embed="rId39"/>
+                    <a:srcRect t="4099"/>
+                    <a:stretch>
+                      <a:fillRect/>
+                    </a:stretch>
+                  </pic:blipFill>
+                  <pic:spPr bwMode="auto">
+                    <a:xfrm>
+                      <a:off x="0" y="0"/>
+                      <a:ext cx="5943600" cy="3030220"/>
+                    </a:xfrm>
+                    <a:prstGeom prst="rect">
+                      <a:avLst/>
+                    </a:prstGeom>
+                    <a:ln>
+                      <a:noFill/>
+                    </a:ln>
+                    <a:extLst>
+                      <a:ext uri="{53640926-AAD7-44D8-BBD7-CCE9431645EC}">
+                        <a14:shadowObscured xmlns:a14="http://schemas.microsoft.com/office/drawing/2010/main"/>
+                      </a:ext>
+                    </a:extLst>
+                  </pic:spPr>
+                </pic:pic>
+              </a:graphicData>
+            </a:graphic>
+          </wp:inline>
+        </w:drawing>
+      </w:r>
+    </w:p>
+    <w:p>
+      <w:pPr>
+        <w:jc w:val="center"/>
+        <w:rPr>
+          <w:lang w:val="es-ES"/>
+        </w:rPr>
+      </w:pPr>
+      <w:r>
+        <w:rPr>
+          <w:lang w:val="es-ES"/>
+        </w:rPr>
+        <w:drawing>
+          <wp:inline distT="0" distB="0" distL="0" distR="0" wp14:anchorId="139A52EB" wp14:editId="4C4E6389">
+            <wp:extent cx="5943600" cy="551815"/>
+            <wp:effectExtent l="0" t="0" r="0" b="0"/>
+            <wp:docPr id="512291091" name="Imagen 1"/>
+            <wp:cNvGraphicFramePr>
+              <a:graphicFrameLocks xmlns:a="http://schemas.openxmlformats.org/drawingml/2006/main" noChangeAspect="1"/>
+            </wp:cNvGraphicFramePr>
+            <a:graphic xmlns:a="http://schemas.openxmlformats.org/drawingml/2006/main">
+              <a:graphicData uri="http://schemas.openxmlformats.org/drawingml/2006/picture">
+                <pic:pic xmlns:pic="http://schemas.openxmlformats.org/drawingml/2006/picture">
+                  <pic:nvPicPr>
+                    <pic:cNvPr id="512291091" name=""/>
+                    <pic:cNvPicPr/>
+                  </pic:nvPicPr>
+                  <pic:blipFill>
+                    <a:blip r:embed="rId40">
+                      <a:clrChange>
+                        <a:clrFrom>
+                          <a:srgbClr val="FFFFFF"/>
+                        </a:clrFrom>
+                        <a:clrTo>
+                          <a:srgbClr val="FFFFFF">
+                            <a:alpha val="0"/>
+                          </a:srgbClr>
+                        </a:clrTo>
+                      </a:clrChange>
+                    </a:blip>
+                    <a:stretch>
+                      <a:fillRect/>
+                    </a:stretch>
+                  </pic:blipFill>
+                  <pic:spPr>
+                    <a:xfrm>
+                      <a:off x="0" y="0"/>
+                      <a:ext cx="5943600" cy="551815"/>
+                    </a:xfrm>
+                    <a:prstGeom prst="rect">
+                      <a:avLst/>
+                    </a:prstGeom>
+                  </pic:spPr>
+                </pic:pic>
+              </a:graphicData>
+            </a:graphic>
+          </wp:inline>
+        </w:drawing>
+      </w:r>
+    </w:p>
+    <w:p>
+      <w:pPr>
+        <w:jc w:val="center"/>
+        <w:rPr>
+          <w:lang w:val="es-ES"/>
+        </w:rPr>
+      </w:pPr>
+      <w:r>
+        <w:rPr>
+          <w:lang w:val="es-ES"/>
+        </w:rPr>
+        <w:drawing>
+          <wp:inline distT="0" distB="0" distL="0" distR="0" wp14:anchorId="64DAA16B" wp14:editId="4373BA41">
+            <wp:extent cx="5943600" cy="859790"/>
+            <wp:effectExtent l="0" t="0" r="0" b="0"/>
+            <wp:docPr id="1272634151" name="Imagen 1"/>
+            <wp:cNvGraphicFramePr>
+              <a:graphicFrameLocks xmlns:a="http://schemas.openxmlformats.org/drawingml/2006/main" noChangeAspect="1"/>
+            </wp:cNvGraphicFramePr>
+            <a:graphic xmlns:a="http://schemas.openxmlformats.org/drawingml/2006/main">
+              <a:graphicData uri="http://schemas.openxmlformats.org/drawingml/2006/picture">
+                <pic:pic xmlns:pic="http://schemas.openxmlformats.org/drawingml/2006/picture">
+                  <pic:nvPicPr>
+                    <pic:cNvPr id="1272634151" name=""/>
+                    <pic:cNvPicPr/>
+                  </pic:nvPicPr>
+                  <pic:blipFill>
+                    <a:blip r:embed="rId41"/>
+                    <a:stretch>
+                      <a:fillRect/>
+                    </a:stretch>
+                  </pic:blipFill>
+                  <pic:spPr>
+                    <a:xfrm>
+                      <a:off x="0" y="0"/>
+                      <a:ext cx="5943600" cy="859790"/>
+                    </a:xfrm>
+                    <a:prstGeom prst="rect">
+                      <a:avLst/>
+                    </a:prstGeom>
+                  </pic:spPr>
+                </pic:pic>
+              </a:graphicData>
+            </a:graphic>
+          </wp:inline>
+        </w:drawing>
+      </w:r>
+    </w:p>
+    <w:p>
+      <w:pPr>
+        <w:pStyle w:val="Ttulo3"/>
+      </w:pPr>
+      <w:bookmarkStart w:id="6" w:name="_Toc230071740"/>
       <w:r>
         <w:lastRenderedPageBreak/>
-        <w:t>Referencias</w:t>
+        <w:t>Django Templates</w:t>
+      </w:r>
+      <w:r>
+        <w:t xml:space="preserve">: </w:t>
+      </w:r>
+      <w:r>
+        <w:t>Variables</w:t>
+      </w:r>
+      <w:r>
+        <w:t xml:space="preserve">, </w:t>
+      </w:r>
+      <w:r>
+        <w:t>Filtros</w:t>
+      </w:r>
+      <w:r>
+        <w:t xml:space="preserve"> y Tags</w:t>
       </w:r>
       <w:bookmarkEnd w:id="6"/>
     </w:p>
     <w:p>
       <w:pPr>
-        <w:rPr>
-          <w:lang w:val="es-MX"/>
-        </w:rPr>
-      </w:pPr>
-      <w:proofErr w:type="spellStart"/>
-      <w:r>
-        <w:rPr>
-          <w:lang w:val="es-MX"/>
-        </w:rPr>
-        <w:t>Platzi</w:t>
-      </w:r>
-      <w:proofErr w:type="spellEnd"/>
-      <w:r>
-        <w:rPr>
-          <w:lang w:val="es-MX"/>
-        </w:rPr>
-        <w:t xml:space="preserve">, </w:t>
-      </w:r>
-      <w:r>
-        <w:rPr>
-          <w:lang w:val="es-MX"/>
-        </w:rPr>
-        <w:t>Luis Martínez</w:t>
-      </w:r>
-      <w:r>
-        <w:rPr>
-          <w:lang w:val="es-MX"/>
-        </w:rPr>
-        <w:t>, “</w:t>
-      </w:r>
-      <w:r>
-        <w:rPr>
-          <w:lang w:val="es-MX"/>
-        </w:rPr>
-        <w:t xml:space="preserve">Curso de </w:t>
-      </w:r>
-      <w:r>
-        <w:rPr>
-          <w:lang w:val="es-MX"/>
-        </w:rPr>
-        <w:t>Django</w:t>
-      </w:r>
-      <w:r>
-        <w:rPr>
-          <w:lang w:val="es-MX"/>
-        </w:rPr>
-        <w:t>”, 20</w:t>
-      </w:r>
-      <w:r>
-        <w:rPr>
-          <w:lang w:val="es-MX"/>
-        </w:rPr>
-        <w:t>2</w:t>
-      </w:r>
-      <w:r>
-        <w:rPr>
-          <w:lang w:val="es-MX"/>
-        </w:rPr>
-        <w:t>4</w:t>
-      </w:r>
-      <w:r>
-        <w:rPr>
-          <w:lang w:val="es-MX"/>
-        </w:rPr>
-        <w:t xml:space="preserve"> [Online], Available: </w:t>
-      </w:r>
-      <w:r>
-        <w:rPr>
-          <w:lang w:val="es-MX"/>
-        </w:rPr>
-        <w:t>https://platzi.com/cursos/django/que-es-django/</w:t>
+        <w:pStyle w:val="Prrafodelista"/>
+        <w:numPr>
+          <w:ilvl w:val="0"/>
+          <w:numId w:val="5"/>
+        </w:numPr>
+        <w:rPr>
+          <w:lang w:val="es-ES"/>
+        </w:rPr>
+      </w:pPr>
+      <w:r>
+        <w:rPr>
+          <w:b/>
+          <w:bCs/>
+          <w:lang w:val="es-ES"/>
+        </w:rPr>
+        <w:t>Variables y Filtros:</w:t>
+      </w:r>
+      <w:r>
+        <w:rPr>
+          <w:lang w:val="es-ES"/>
+        </w:rPr>
+        <w:t xml:space="preserve"> </w:t>
+      </w:r>
+      <w:r>
+        <w:rPr>
+          <w:lang w:val="es-ES"/>
+        </w:rPr>
+        <w:t xml:space="preserve">Dentro de los </w:t>
+      </w:r>
+      <w:proofErr w:type="spellStart"/>
+      <w:r>
+        <w:rPr>
+          <w:lang w:val="es-ES"/>
+        </w:rPr>
+        <w:t>templates</w:t>
+      </w:r>
+      <w:proofErr w:type="spellEnd"/>
+      <w:r>
+        <w:rPr>
+          <w:lang w:val="es-ES"/>
+        </w:rPr>
+        <w:t xml:space="preserve"> que utiliza Django, se pueden declarar variables a través de doble llave {{}} y también se pueden indicar filtros a través de pipelines (|) a través de la siguiente sintaxis:</w:t>
       </w:r>
     </w:p>
     <w:p>
       <w:pPr>
-        <w:rPr>
-          <w:lang w:val="es-MX"/>
-        </w:rPr>
-      </w:pPr>
+        <w:ind w:left="300" w:firstLine="420"/>
+        <w:rPr>
+          <w:b/>
+          <w:bCs/>
+          <w:lang w:val="es-ES"/>
+        </w:rPr>
+      </w:pPr>
+      <w:r>
+        <w:rPr>
+          <w:b/>
+          <w:bCs/>
+          <w:lang w:val="es-ES"/>
+        </w:rPr>
+        <w:t>{{</w:t>
+      </w:r>
+      <w:r>
+        <w:rPr>
+          <w:b/>
+          <w:bCs/>
+          <w:color w:val="7030A0"/>
+          <w:lang w:val="es-ES"/>
+        </w:rPr>
+        <w:t xml:space="preserve">variable </w:t>
+      </w:r>
+      <w:r>
+        <w:rPr>
+          <w:b/>
+          <w:bCs/>
+          <w:lang w:val="es-ES"/>
+        </w:rPr>
+        <w:t xml:space="preserve">| </w:t>
+      </w:r>
+      <w:r>
+        <w:rPr>
+          <w:b/>
+          <w:bCs/>
+          <w:color w:val="00FFFF"/>
+          <w:lang w:val="es-ES"/>
+        </w:rPr>
+        <w:t xml:space="preserve">filtro_1 </w:t>
+      </w:r>
+      <w:r>
+        <w:rPr>
+          <w:b/>
+          <w:bCs/>
+          <w:lang w:val="es-ES"/>
+        </w:rPr>
+        <w:t xml:space="preserve">| </w:t>
+      </w:r>
+      <w:r>
+        <w:rPr>
+          <w:b/>
+          <w:bCs/>
+          <w:color w:val="00FFFF"/>
+          <w:lang w:val="es-ES"/>
+        </w:rPr>
+        <w:t>filtro_2</w:t>
+      </w:r>
+      <w:r>
+        <w:rPr>
+          <w:b/>
+          <w:bCs/>
+          <w:lang w:val="es-ES"/>
+        </w:rPr>
+        <w:t>}}</w:t>
+      </w:r>
     </w:p>
     <w:p>
       <w:pPr>
+        <w:pStyle w:val="Prrafodelista"/>
+        <w:numPr>
+          <w:ilvl w:val="0"/>
+          <w:numId w:val="5"/>
+        </w:numPr>
+        <w:rPr>
+          <w:lang w:val="es-ES"/>
+        </w:rPr>
+      </w:pPr>
+      <w:r>
+        <w:rPr>
+          <w:b/>
+          <w:bCs/>
+          <w:lang w:val="es-MX"/>
+        </w:rPr>
+        <w:t>Tags:</w:t>
+      </w:r>
+      <w:r>
+        <w:rPr>
+          <w:lang w:val="es-MX"/>
+        </w:rPr>
+        <w:t xml:space="preserve"> Se denotan con el símbolo de porcentaje % y llaves simples {}, permitiéndonos añadir funcionalidad a nuestro código HTML, como lo pueden ser ciclos </w:t>
+      </w:r>
+      <w:proofErr w:type="spellStart"/>
+      <w:r>
+        <w:rPr>
+          <w:lang w:val="es-MX"/>
+        </w:rPr>
+        <w:t>for</w:t>
+      </w:r>
+      <w:proofErr w:type="spellEnd"/>
+      <w:r>
+        <w:rPr>
+          <w:lang w:val="es-MX"/>
+        </w:rPr>
+        <w:t xml:space="preserve">, condicionales y </w:t>
+      </w:r>
+      <w:proofErr w:type="spellStart"/>
+      <w:r>
+        <w:rPr>
+          <w:lang w:val="es-MX"/>
+        </w:rPr>
+        <w:t>urls</w:t>
+      </w:r>
+      <w:proofErr w:type="spellEnd"/>
+      <w:r>
+        <w:rPr>
+          <w:lang w:val="es-MX"/>
+        </w:rPr>
+        <w:t xml:space="preserve">. De igual forma se debe añadir un tag de cierre con el nombre </w:t>
+      </w:r>
+      <w:proofErr w:type="spellStart"/>
+      <w:r>
+        <w:rPr>
+          <w:lang w:val="es-MX"/>
+        </w:rPr>
+        <w:t>endif</w:t>
+      </w:r>
+      <w:proofErr w:type="spellEnd"/>
+      <w:r>
+        <w:rPr>
+          <w:lang w:val="es-MX"/>
+        </w:rPr>
+        <w:t xml:space="preserve"> o </w:t>
+      </w:r>
+      <w:proofErr w:type="spellStart"/>
+      <w:r>
+        <w:rPr>
+          <w:lang w:val="es-MX"/>
+        </w:rPr>
+        <w:t>endfor</w:t>
+      </w:r>
+      <w:proofErr w:type="spellEnd"/>
+      <w:r>
+        <w:rPr>
+          <w:lang w:val="es-MX"/>
+        </w:rPr>
+        <w:t>.</w:t>
+      </w:r>
+    </w:p>
+    <w:p>
+      <w:pPr>
+        <w:ind w:left="300" w:firstLine="420"/>
+        <w:rPr>
+          <w:b/>
+          <w:bCs/>
+        </w:rPr>
+      </w:pPr>
+      <w:r>
+        <w:rPr>
+          <w:b/>
+          <w:bCs/>
+        </w:rPr>
+        <w:t>{{</w:t>
+      </w:r>
+      <w:r>
+        <w:rPr>
+          <w:b/>
+          <w:bCs/>
+        </w:rPr>
+        <w:t>%</w:t>
+      </w:r>
+      <w:r>
+        <w:rPr>
+          <w:b/>
+          <w:bCs/>
+          <w:color w:val="7030A0"/>
+        </w:rPr>
+        <w:t>if</w:t>
+      </w:r>
+      <w:r>
+        <w:rPr>
+          <w:b/>
+          <w:bCs/>
+        </w:rPr>
+        <w:t>,</w:t>
+      </w:r>
+      <w:r>
+        <w:rPr>
+          <w:b/>
+          <w:bCs/>
+        </w:rPr>
+        <w:t xml:space="preserve"> </w:t>
+      </w:r>
+      <w:r>
+        <w:rPr>
+          <w:b/>
+          <w:bCs/>
+          <w:color w:val="7030A0"/>
+        </w:rPr>
+        <w:t xml:space="preserve">for </w:t>
+      </w:r>
+      <w:r>
+        <w:rPr>
+          <w:b/>
+          <w:bCs/>
+        </w:rPr>
+        <w:t>o</w:t>
+      </w:r>
+      <w:r>
+        <w:rPr>
+          <w:b/>
+          <w:bCs/>
+        </w:rPr>
+        <w:t xml:space="preserve"> </w:t>
+      </w:r>
+      <w:proofErr w:type="spellStart"/>
+      <w:proofErr w:type="gramStart"/>
+      <w:r>
+        <w:rPr>
+          <w:b/>
+          <w:bCs/>
+          <w:color w:val="7030A0"/>
+        </w:rPr>
+        <w:t>url</w:t>
+      </w:r>
+      <w:proofErr w:type="spellEnd"/>
+      <w:r>
+        <w:rPr>
+          <w:b/>
+          <w:bCs/>
+        </w:rPr>
+        <w:t>%}}</w:t>
+      </w:r>
+      <w:proofErr w:type="gramEnd"/>
+    </w:p>
+    <w:p>
+      <w:pPr>
+        <w:ind w:left="300" w:firstLine="420"/>
+        <w:rPr>
+          <w:b/>
+          <w:bCs/>
+          <w:lang w:val="es-MX"/>
+        </w:rPr>
+      </w:pPr>
+      <w:r>
+        <w:rPr>
+          <w:b/>
+          <w:bCs/>
+          <w:lang w:val="es-MX"/>
+        </w:rPr>
+        <w:t>{{%</w:t>
+      </w:r>
+      <w:proofErr w:type="spellStart"/>
+      <w:r>
+        <w:rPr>
+          <w:b/>
+          <w:bCs/>
+          <w:color w:val="7030A0"/>
+          <w:lang w:val="es-MX"/>
+        </w:rPr>
+        <w:t>endi</w:t>
+      </w:r>
+      <w:r>
+        <w:rPr>
+          <w:b/>
+          <w:bCs/>
+          <w:color w:val="7030A0"/>
+          <w:lang w:val="es-MX"/>
+        </w:rPr>
+        <w:t>f</w:t>
+      </w:r>
+      <w:proofErr w:type="spellEnd"/>
+      <w:r>
+        <w:rPr>
+          <w:b/>
+          <w:bCs/>
+          <w:lang w:val="es-MX"/>
+        </w:rPr>
+        <w:t xml:space="preserve"> </w:t>
+      </w:r>
+      <w:r>
+        <w:rPr>
+          <w:b/>
+          <w:bCs/>
+          <w:lang w:val="es-MX"/>
+        </w:rPr>
+        <w:t xml:space="preserve">o </w:t>
+      </w:r>
+      <w:proofErr w:type="spellStart"/>
+      <w:r>
+        <w:rPr>
+          <w:b/>
+          <w:bCs/>
+          <w:color w:val="7030A0"/>
+          <w:lang w:val="es-MX"/>
+        </w:rPr>
+        <w:t>endfor</w:t>
+      </w:r>
+      <w:proofErr w:type="spellEnd"/>
+      <w:r>
+        <w:rPr>
+          <w:b/>
+          <w:bCs/>
+          <w:lang w:val="es-MX"/>
+        </w:rPr>
+        <w:t>%}}</w:t>
+      </w:r>
+    </w:p>
+    <w:p>
+      <w:pPr>
+        <w:rPr>
+          <w:lang w:val="es-MX"/>
+        </w:rPr>
+      </w:pPr>
+      <w:r>
+        <w:rPr>
+          <w:lang w:val="es-MX"/>
+        </w:rPr>
+        <w:t>De ig</w:t>
+      </w:r>
+      <w:r>
+        <w:rPr>
+          <w:lang w:val="es-MX"/>
+        </w:rPr>
+        <w:t xml:space="preserve">ual forma, tenemos algo llamado Base.html, el cual se refiere a un archivo que nos permite tener contenido que es común dentro de nuestra aplicación, para que pueda ser reutilizado sin que se tenga que reescribir todo el código. En la parte inferior podemos observar un bloque, si luego se crea otro elemento del </w:t>
+      </w:r>
+      <w:proofErr w:type="spellStart"/>
+      <w:r>
+        <w:rPr>
+          <w:lang w:val="es-MX"/>
+        </w:rPr>
+        <w:t>template</w:t>
+      </w:r>
+      <w:proofErr w:type="spellEnd"/>
+      <w:r>
+        <w:rPr>
+          <w:lang w:val="es-MX"/>
+        </w:rPr>
+        <w:t xml:space="preserve"> que lo extienda, lo que se cree dentro de este podrá ser reutilizado en otras partes del código, teniendo así módulos repetibles con información dinámica, de forma parecida a como se hace con React.js</w:t>
+      </w:r>
+    </w:p>
+    <w:p>
+      <w:pPr>
+        <w:jc w:val="center"/>
+        <w:rPr>
+          <w:lang w:val="es-MX"/>
+        </w:rPr>
+      </w:pPr>
+      <w:r>
+        <w:drawing>
+          <wp:inline distT="0" distB="0" distL="0" distR="0" wp14:anchorId="2D9B5EF3" wp14:editId="1C111916">
+            <wp:extent cx="1193800" cy="1694728"/>
+            <wp:effectExtent l="0" t="0" r="6350" b="1270"/>
+            <wp:docPr id="1345169033" name="Imagen 1"/>
+            <wp:cNvGraphicFramePr>
+              <a:graphicFrameLocks xmlns:a="http://schemas.openxmlformats.org/drawingml/2006/main" noChangeAspect="1"/>
+            </wp:cNvGraphicFramePr>
+            <a:graphic xmlns:a="http://schemas.openxmlformats.org/drawingml/2006/main">
+              <a:graphicData uri="http://schemas.openxmlformats.org/drawingml/2006/picture">
+                <pic:pic xmlns:pic="http://schemas.openxmlformats.org/drawingml/2006/picture">
+                  <pic:nvPicPr>
+                    <pic:cNvPr id="1345169033" name=""/>
+                    <pic:cNvPicPr/>
+                  </pic:nvPicPr>
+                  <pic:blipFill>
+                    <a:blip r:embed="rId42"/>
+                    <a:stretch>
+                      <a:fillRect/>
+                    </a:stretch>
+                  </pic:blipFill>
+                  <pic:spPr>
+                    <a:xfrm>
+                      <a:off x="0" y="0"/>
+                      <a:ext cx="1204466" cy="1709870"/>
+                    </a:xfrm>
+                    <a:prstGeom prst="rect">
+                      <a:avLst/>
+                    </a:prstGeom>
+                  </pic:spPr>
+                </pic:pic>
+              </a:graphicData>
+            </a:graphic>
+          </wp:inline>
+        </w:drawing>
+      </w:r>
+      <w:r>
+        <w:drawing>
+          <wp:inline distT="0" distB="0" distL="0" distR="0" wp14:anchorId="65BE5C42" wp14:editId="4811B9C3">
+            <wp:extent cx="1447800" cy="1692728"/>
+            <wp:effectExtent l="0" t="0" r="0" b="3175"/>
+            <wp:docPr id="1456868691" name="Imagen 1"/>
+            <wp:cNvGraphicFramePr>
+              <a:graphicFrameLocks xmlns:a="http://schemas.openxmlformats.org/drawingml/2006/main" noChangeAspect="1"/>
+            </wp:cNvGraphicFramePr>
+            <a:graphic xmlns:a="http://schemas.openxmlformats.org/drawingml/2006/main">
+              <a:graphicData uri="http://schemas.openxmlformats.org/drawingml/2006/picture">
+                <pic:pic xmlns:pic="http://schemas.openxmlformats.org/drawingml/2006/picture">
+                  <pic:nvPicPr>
+                    <pic:cNvPr id="1456868691" name=""/>
+                    <pic:cNvPicPr/>
+                  </pic:nvPicPr>
+                  <pic:blipFill>
+                    <a:blip r:embed="rId43"/>
+                    <a:stretch>
+                      <a:fillRect/>
+                    </a:stretch>
+                  </pic:blipFill>
+                  <pic:spPr>
+                    <a:xfrm>
+                      <a:off x="0" y="0"/>
+                      <a:ext cx="1455345" cy="1701549"/>
+                    </a:xfrm>
+                    <a:prstGeom prst="rect">
+                      <a:avLst/>
+                    </a:prstGeom>
+                  </pic:spPr>
+                </pic:pic>
+              </a:graphicData>
+            </a:graphic>
+          </wp:inline>
+        </w:drawing>
+      </w:r>
+      <w:r>
+        <w:rPr>
+          <w:noProof/>
+          <w:lang w:val="es-MX"/>
+        </w:rPr>
+        <w:drawing>
+          <wp:inline distT="0" distB="0" distL="0" distR="0" wp14:anchorId="0B41486A" wp14:editId="199647BD">
+            <wp:extent cx="3225800" cy="1683586"/>
+            <wp:effectExtent l="0" t="0" r="0" b="0"/>
+            <wp:docPr id="1716531276" name="Imagen 1"/>
+            <wp:cNvGraphicFramePr>
+              <a:graphicFrameLocks xmlns:a="http://schemas.openxmlformats.org/drawingml/2006/main" noChangeAspect="1"/>
+            </wp:cNvGraphicFramePr>
+            <a:graphic xmlns:a="http://schemas.openxmlformats.org/drawingml/2006/main">
+              <a:graphicData uri="http://schemas.openxmlformats.org/drawingml/2006/picture">
+                <pic:pic xmlns:pic="http://schemas.openxmlformats.org/drawingml/2006/picture">
+                  <pic:nvPicPr>
+                    <pic:cNvPr id="1716531276" name=""/>
+                    <pic:cNvPicPr/>
+                  </pic:nvPicPr>
+                  <pic:blipFill>
+                    <a:blip r:embed="rId44"/>
+                    <a:stretch>
+                      <a:fillRect/>
+                    </a:stretch>
+                  </pic:blipFill>
+                  <pic:spPr>
+                    <a:xfrm>
+                      <a:off x="0" y="0"/>
+                      <a:ext cx="3225800" cy="1683586"/>
+                    </a:xfrm>
+                    <a:prstGeom prst="rect">
+                      <a:avLst/>
+                    </a:prstGeom>
+                  </pic:spPr>
+                </pic:pic>
+              </a:graphicData>
+            </a:graphic>
+          </wp:inline>
+        </w:drawing>
+      </w:r>
+    </w:p>
+    <w:p>
+      <w:pPr>
+        <w:jc w:val="center"/>
+        <w:rPr>
+          <w:lang w:val="es-MX"/>
+        </w:rPr>
+      </w:pPr>
+    </w:p>
+    <w:p>
+      <w:pPr>
+        <w:pStyle w:val="Ttulo1"/>
+      </w:pPr>
+      <w:bookmarkStart w:id="7" w:name="_Toc230071741"/>
+      <w:r>
+        <w:t>Ejemplo: Proyecto Coffee Shop</w:t>
+      </w:r>
+      <w:bookmarkEnd w:id="7"/>
+    </w:p>
+    <w:p>
+      <w:pPr>
+        <w:rPr>
+          <w:lang w:val="es-ES"/>
+        </w:rPr>
+      </w:pPr>
+    </w:p>
+    <w:p>
+      <w:pPr>
+        <w:rPr>
+          <w:lang w:val="es-MX"/>
+        </w:rPr>
+      </w:pPr>
+    </w:p>
+    <w:p>
+      <w:pPr>
+        <w:pStyle w:val="Ttulo1"/>
+      </w:pPr>
+      <w:bookmarkStart w:id="8" w:name="_Toc230071742"/>
+      <w:r>
+        <w:t>Referencias</w:t>
+      </w:r>
+      <w:bookmarkEnd w:id="8"/>
+    </w:p>
+    <w:p>
+      <w:pPr>
+        <w:rPr>
+          <w:lang w:val="es-MX"/>
+        </w:rPr>
+      </w:pPr>
+      <w:proofErr w:type="spellStart"/>
+      <w:r>
+        <w:rPr>
+          <w:lang w:val="es-MX"/>
+        </w:rPr>
+        <w:t>Platzi</w:t>
+      </w:r>
+      <w:proofErr w:type="spellEnd"/>
+      <w:r>
+        <w:rPr>
+          <w:lang w:val="es-MX"/>
+        </w:rPr>
+        <w:t xml:space="preserve">, </w:t>
+      </w:r>
+      <w:r>
+        <w:rPr>
+          <w:lang w:val="es-MX"/>
+        </w:rPr>
+        <w:t>Luis Martínez</w:t>
+      </w:r>
+      <w:r>
+        <w:rPr>
+          <w:lang w:val="es-MX"/>
+        </w:rPr>
+        <w:t>, “</w:t>
+      </w:r>
+      <w:r>
+        <w:rPr>
+          <w:lang w:val="es-MX"/>
+        </w:rPr>
+        <w:t xml:space="preserve">Curso de </w:t>
+      </w:r>
+      <w:r>
+        <w:rPr>
+          <w:lang w:val="es-MX"/>
+        </w:rPr>
+        <w:t>Django</w:t>
+      </w:r>
+      <w:r>
+        <w:rPr>
+          <w:lang w:val="es-MX"/>
+        </w:rPr>
+        <w:t>”, 20</w:t>
+      </w:r>
+      <w:r>
+        <w:rPr>
+          <w:lang w:val="es-MX"/>
+        </w:rPr>
+        <w:t>2</w:t>
+      </w:r>
+      <w:r>
+        <w:rPr>
+          <w:lang w:val="es-MX"/>
+        </w:rPr>
+        <w:t>4</w:t>
+      </w:r>
+      <w:r>
+        <w:rPr>
+          <w:lang w:val="es-MX"/>
+        </w:rPr>
+        <w:t xml:space="preserve"> [Online], Available: </w:t>
+      </w:r>
+      <w:r>
+        <w:rPr>
+          <w:lang w:val="es-MX"/>
+        </w:rPr>
+        <w:t>https://platzi.com/cursos/django/que-es-django/</w:t>
+      </w:r>
+    </w:p>
+    <w:p>
+      <w:pPr>
+        <w:rPr>
+          <w:lang w:val="es-MX"/>
+        </w:rPr>
+      </w:pPr>
+    </w:p>
+    <w:p>
+      <w:pPr>
         <w:rPr>
           <w:lang w:val="es-MX"/>
         </w:rPr>
       </w:pPr>
     </w:p>
     <w:sectPr>
-      <w:footerReference w:type="default" r:id="rId37"/>
+      <w:footerReference w:type="default" r:id="rId45"/>
       <w:pgSz w:w="12240" w:h="15840" w:code="1"/>
       <w:pgMar w:top="1440" w:right="1440" w:bottom="1440" w:left="1440" w:header="720" w:footer="720" w:gutter="0"/>
       <w:pgNumType w:start="0"/>
@@ -12609,7 +13943,7 @@
   <w:abstractNum w:abstractNumId="4" w15:restartNumberingAfterBreak="0">
     <w:nsid w:val="5D764975"/>
     <w:multiLevelType w:val="hybridMultilevel"/>
-    <w:tmpl w:val="C53E4D5E"/>
+    <w:tmpl w:val="1D943228"/>
     <w:lvl w:ilvl="0" w:tplc="080A0001">
       <w:start w:val="1"/>
       <w:numFmt w:val="bullet"/>
@@ -13193,7 +14527,6 @@
   <w:style w:type="character" w:default="1" w:styleId="Fuentedeprrafopredeter">
     <w:name w:val="Default Paragraph Font"/>
     <w:uiPriority w:val="1"/>
-    <w:semiHidden/>
     <w:unhideWhenUsed/>
   </w:style>
   <w:style w:type="table" w:default="1" w:styleId="Tablanormal">
@@ -13935,6 +15268,10 @@
 </file>
 
 <file path=customXml/item1.xml><?xml version="1.0" encoding="utf-8"?>
+<b:Sources xmlns:b="http://schemas.openxmlformats.org/officeDocument/2006/bibliography" xmlns="http://schemas.openxmlformats.org/officeDocument/2006/bibliography" SelectedStyle="\APASixthEditionOfficeOnline.xsl" StyleName="APA" Version="6"/>
+</file>
+
+<file path=customXml/item2.xml><?xml version="1.0" encoding="utf-8"?>
 <s:customData xmlns="http://www.wps.cn/officeDocument/2013/wpsCustomData" xmlns:s="http://www.wps.cn/officeDocument/2013/wpsCustomData">
   <customSectProps>
     <customSectPr/>
@@ -13945,22 +15282,18 @@
 </s:customData>
 </file>
 
-<file path=customXml/item2.xml><?xml version="1.0" encoding="utf-8"?>
-<b:Sources xmlns:b="http://schemas.openxmlformats.org/officeDocument/2006/bibliography" xmlns="http://schemas.openxmlformats.org/officeDocument/2006/bibliography" SelectedStyle="\APASixthEditionOfficeOnline.xsl" StyleName="APA" Version="6"/>
+<file path=customXml/itemProps1.xml><?xml version="1.0" encoding="utf-8"?>
+<ds:datastoreItem xmlns:ds="http://schemas.openxmlformats.org/officeDocument/2006/customXml" ds:itemID="{851A7482-30F0-4AF0-9C85-18995F48D7BA}">
+  <ds:schemaRefs>
+    <ds:schemaRef ds:uri="http://schemas.openxmlformats.org/officeDocument/2006/bibliography"/>
+  </ds:schemaRefs>
+</ds:datastoreItem>
 </file>
 
-<file path=customXml/itemProps1.xml><?xml version="1.0" encoding="utf-8"?>
+<file path=customXml/itemProps2.xml><?xml version="1.0" encoding="utf-8"?>
 <ds:datastoreItem xmlns:ds="http://schemas.openxmlformats.org/officeDocument/2006/customXml" ds:itemID="{B1977F7D-205B-4081-913C-38D41E755F92}">
   <ds:schemaRefs>
     <ds:schemaRef ds:uri="http://www.wps.cn/officeDocument/2013/wpsCustomData"/>
   </ds:schemaRefs>
 </ds:datastoreItem>
-</file>
-
-<file path=customXml/itemProps2.xml><?xml version="1.0" encoding="utf-8"?>
-<ds:datastoreItem xmlns:ds="http://schemas.openxmlformats.org/officeDocument/2006/customXml" ds:itemID="{851A7482-30F0-4AF0-9C85-18995F48D7BA}">
-  <ds:schemaRefs>
-    <ds:schemaRef ds:uri="http://schemas.openxmlformats.org/officeDocument/2006/bibliography"/>
-  </ds:schemaRefs>
-</ds:datastoreItem>
 </file>
</xml_diff>